<commit_message>
incorporating ENUM values / logical relationships between the tables
Updated the first draft of the database by adding ENUM values and defining the relationships between tables.
</commit_message>
<xml_diff>
--- a/docs/phase2/Dollar Doodle Database Tables and Attributes.docx
+++ b/docs/phase2/Dollar Doodle Database Tables and Attributes.docx
@@ -393,13 +393,23 @@
                 <w14:ligatures w14:val="none"/>
               </w:rPr>
             </w:pPr>
-            <w:r>
-              <w:rPr>
-                <w:rFonts w:ascii="Times New Roman" w:eastAsia="Times New Roman" w:hAnsi="Times New Roman" w:cs="Times New Roman"/>
-                <w:kern w:val="0"/>
-                <w14:ligatures w14:val="none"/>
-              </w:rPr>
-              <w:t>VARCHAR(255)</w:t>
+            <w:proofErr w:type="gramStart"/>
+            <w:r>
+              <w:rPr>
+                <w:rFonts w:ascii="Times New Roman" w:eastAsia="Times New Roman" w:hAnsi="Times New Roman" w:cs="Times New Roman"/>
+                <w:kern w:val="0"/>
+                <w14:ligatures w14:val="none"/>
+              </w:rPr>
+              <w:t>VARCHAR(</w:t>
+            </w:r>
+            <w:proofErr w:type="gramEnd"/>
+            <w:r>
+              <w:rPr>
+                <w:rFonts w:ascii="Times New Roman" w:eastAsia="Times New Roman" w:hAnsi="Times New Roman" w:cs="Times New Roman"/>
+                <w:kern w:val="0"/>
+                <w14:ligatures w14:val="none"/>
+              </w:rPr>
+              <w:t>255)</w:t>
             </w:r>
           </w:p>
         </w:tc>
@@ -490,13 +500,23 @@
                 <w14:ligatures w14:val="none"/>
               </w:rPr>
             </w:pPr>
-            <w:r>
-              <w:rPr>
-                <w:rFonts w:ascii="Times New Roman" w:eastAsia="Times New Roman" w:hAnsi="Times New Roman" w:cs="Times New Roman"/>
-                <w:kern w:val="0"/>
-                <w14:ligatures w14:val="none"/>
-              </w:rPr>
-              <w:t>VARCHAR(255)</w:t>
+            <w:proofErr w:type="gramStart"/>
+            <w:r>
+              <w:rPr>
+                <w:rFonts w:ascii="Times New Roman" w:eastAsia="Times New Roman" w:hAnsi="Times New Roman" w:cs="Times New Roman"/>
+                <w:kern w:val="0"/>
+                <w14:ligatures w14:val="none"/>
+              </w:rPr>
+              <w:t>VARCHAR(</w:t>
+            </w:r>
+            <w:proofErr w:type="gramEnd"/>
+            <w:r>
+              <w:rPr>
+                <w:rFonts w:ascii="Times New Roman" w:eastAsia="Times New Roman" w:hAnsi="Times New Roman" w:cs="Times New Roman"/>
+                <w:kern w:val="0"/>
+                <w14:ligatures w14:val="none"/>
+              </w:rPr>
+              <w:t>255)</w:t>
             </w:r>
           </w:p>
         </w:tc>
@@ -585,13 +605,23 @@
                 <w14:ligatures w14:val="none"/>
               </w:rPr>
             </w:pPr>
-            <w:r>
-              <w:rPr>
-                <w:rFonts w:ascii="Times New Roman" w:eastAsia="Times New Roman" w:hAnsi="Times New Roman" w:cs="Times New Roman"/>
-                <w:kern w:val="0"/>
-                <w14:ligatures w14:val="none"/>
-              </w:rPr>
-              <w:t>VARCHAR(100)</w:t>
+            <w:proofErr w:type="gramStart"/>
+            <w:r>
+              <w:rPr>
+                <w:rFonts w:ascii="Times New Roman" w:eastAsia="Times New Roman" w:hAnsi="Times New Roman" w:cs="Times New Roman"/>
+                <w:kern w:val="0"/>
+                <w14:ligatures w14:val="none"/>
+              </w:rPr>
+              <w:t>VARCHAR(</w:t>
+            </w:r>
+            <w:proofErr w:type="gramEnd"/>
+            <w:r>
+              <w:rPr>
+                <w:rFonts w:ascii="Times New Roman" w:eastAsia="Times New Roman" w:hAnsi="Times New Roman" w:cs="Times New Roman"/>
+                <w:kern w:val="0"/>
+                <w14:ligatures w14:val="none"/>
+              </w:rPr>
+              <w:t>100)</w:t>
             </w:r>
           </w:p>
         </w:tc>
@@ -714,13 +744,23 @@
                 <w14:ligatures w14:val="none"/>
               </w:rPr>
             </w:pPr>
-            <w:r>
-              <w:rPr>
-                <w:rFonts w:ascii="Times New Roman" w:eastAsia="Times New Roman" w:hAnsi="Times New Roman" w:cs="Times New Roman"/>
-                <w:kern w:val="0"/>
-                <w14:ligatures w14:val="none"/>
-              </w:rPr>
-              <w:t>VARCHAR(100)</w:t>
+            <w:proofErr w:type="gramStart"/>
+            <w:r>
+              <w:rPr>
+                <w:rFonts w:ascii="Times New Roman" w:eastAsia="Times New Roman" w:hAnsi="Times New Roman" w:cs="Times New Roman"/>
+                <w:kern w:val="0"/>
+                <w14:ligatures w14:val="none"/>
+              </w:rPr>
+              <w:t>VARCHAR(</w:t>
+            </w:r>
+            <w:proofErr w:type="gramEnd"/>
+            <w:r>
+              <w:rPr>
+                <w:rFonts w:ascii="Times New Roman" w:eastAsia="Times New Roman" w:hAnsi="Times New Roman" w:cs="Times New Roman"/>
+                <w:kern w:val="0"/>
+                <w14:ligatures w14:val="none"/>
+              </w:rPr>
+              <w:t>100)</w:t>
             </w:r>
           </w:p>
         </w:tc>
@@ -835,13 +875,23 @@
                 <w14:ligatures w14:val="none"/>
               </w:rPr>
             </w:pPr>
-            <w:r>
-              <w:rPr>
-                <w:rFonts w:ascii="Times New Roman" w:eastAsia="Times New Roman" w:hAnsi="Times New Roman" w:cs="Times New Roman"/>
-                <w:kern w:val="0"/>
-                <w14:ligatures w14:val="none"/>
-              </w:rPr>
-              <w:t>VARCHAR(500)</w:t>
+            <w:proofErr w:type="gramStart"/>
+            <w:r>
+              <w:rPr>
+                <w:rFonts w:ascii="Times New Roman" w:eastAsia="Times New Roman" w:hAnsi="Times New Roman" w:cs="Times New Roman"/>
+                <w:kern w:val="0"/>
+                <w14:ligatures w14:val="none"/>
+              </w:rPr>
+              <w:t>VARCHAR(</w:t>
+            </w:r>
+            <w:proofErr w:type="gramEnd"/>
+            <w:r>
+              <w:rPr>
+                <w:rFonts w:ascii="Times New Roman" w:eastAsia="Times New Roman" w:hAnsi="Times New Roman" w:cs="Times New Roman"/>
+                <w:kern w:val="0"/>
+                <w14:ligatures w14:val="none"/>
+              </w:rPr>
+              <w:t>500)</w:t>
             </w:r>
           </w:p>
         </w:tc>
@@ -1506,9 +1556,9 @@
         <w:tblLook w:val="04A0" w:firstRow="1" w:lastRow="0" w:firstColumn="1" w:lastColumn="0" w:noHBand="0" w:noVBand="1"/>
       </w:tblPr>
       <w:tblGrid>
-        <w:gridCol w:w="2548"/>
-        <w:gridCol w:w="2592"/>
-        <w:gridCol w:w="6140"/>
+        <w:gridCol w:w="2596"/>
+        <w:gridCol w:w="2641"/>
+        <w:gridCol w:w="6043"/>
       </w:tblGrid>
       <w:tr>
         <w:trPr>
@@ -1922,13 +1972,23 @@
                 <w14:ligatures w14:val="none"/>
               </w:rPr>
             </w:pPr>
-            <w:r>
-              <w:rPr>
-                <w:rFonts w:ascii="Times New Roman" w:eastAsia="Times New Roman" w:hAnsi="Times New Roman" w:cs="Times New Roman"/>
-                <w:kern w:val="0"/>
-                <w14:ligatures w14:val="none"/>
-              </w:rPr>
-              <w:t>DECIMAL(10,2)</w:t>
+            <w:proofErr w:type="gramStart"/>
+            <w:r>
+              <w:rPr>
+                <w:rFonts w:ascii="Times New Roman" w:eastAsia="Times New Roman" w:hAnsi="Times New Roman" w:cs="Times New Roman"/>
+                <w:kern w:val="0"/>
+                <w14:ligatures w14:val="none"/>
+              </w:rPr>
+              <w:t>DECIMAL(</w:t>
+            </w:r>
+            <w:proofErr w:type="gramEnd"/>
+            <w:r>
+              <w:rPr>
+                <w:rFonts w:ascii="Times New Roman" w:eastAsia="Times New Roman" w:hAnsi="Times New Roman" w:cs="Times New Roman"/>
+                <w:kern w:val="0"/>
+                <w14:ligatures w14:val="none"/>
+              </w:rPr>
+              <w:t>10,2)</w:t>
             </w:r>
           </w:p>
         </w:tc>
@@ -2156,13 +2216,23 @@
                 <w14:ligatures w14:val="none"/>
               </w:rPr>
             </w:pPr>
-            <w:r>
-              <w:rPr>
-                <w:rFonts w:ascii="Times New Roman" w:eastAsia="Times New Roman" w:hAnsi="Times New Roman" w:cs="Times New Roman"/>
-                <w:kern w:val="0"/>
-                <w14:ligatures w14:val="none"/>
-              </w:rPr>
-              <w:t>VARCHAR(255)</w:t>
+            <w:proofErr w:type="gramStart"/>
+            <w:r>
+              <w:rPr>
+                <w:rFonts w:ascii="Times New Roman" w:eastAsia="Times New Roman" w:hAnsi="Times New Roman" w:cs="Times New Roman"/>
+                <w:kern w:val="0"/>
+                <w14:ligatures w14:val="none"/>
+              </w:rPr>
+              <w:t>VARCHAR(</w:t>
+            </w:r>
+            <w:proofErr w:type="gramEnd"/>
+            <w:r>
+              <w:rPr>
+                <w:rFonts w:ascii="Times New Roman" w:eastAsia="Times New Roman" w:hAnsi="Times New Roman" w:cs="Times New Roman"/>
+                <w:kern w:val="0"/>
+                <w14:ligatures w14:val="none"/>
+              </w:rPr>
+              <w:t>255)</w:t>
             </w:r>
           </w:p>
         </w:tc>
@@ -2632,13 +2702,23 @@
                 <w14:ligatures w14:val="none"/>
               </w:rPr>
             </w:pPr>
-            <w:r>
-              <w:rPr>
-                <w:rFonts w:ascii="Times New Roman" w:eastAsia="Times New Roman" w:hAnsi="Times New Roman" w:cs="Times New Roman"/>
-                <w:kern w:val="0"/>
-                <w14:ligatures w14:val="none"/>
-              </w:rPr>
-              <w:t>VARCHAR(500)</w:t>
+            <w:proofErr w:type="gramStart"/>
+            <w:r>
+              <w:rPr>
+                <w:rFonts w:ascii="Times New Roman" w:eastAsia="Times New Roman" w:hAnsi="Times New Roman" w:cs="Times New Roman"/>
+                <w:kern w:val="0"/>
+                <w14:ligatures w14:val="none"/>
+              </w:rPr>
+              <w:t>VARCHAR(</w:t>
+            </w:r>
+            <w:proofErr w:type="gramEnd"/>
+            <w:r>
+              <w:rPr>
+                <w:rFonts w:ascii="Times New Roman" w:eastAsia="Times New Roman" w:hAnsi="Times New Roman" w:cs="Times New Roman"/>
+                <w:kern w:val="0"/>
+                <w14:ligatures w14:val="none"/>
+              </w:rPr>
+              <w:t>500)</w:t>
             </w:r>
           </w:p>
         </w:tc>
@@ -2685,74 +2765,38 @@
               <w:right w:w="240" w:type="dxa"/>
             </w:tcMar>
             <w:vAlign w:val="center"/>
-            <w:hideMark/>
-          </w:tcPr>
-          <w:p>
-            <w:pPr>
-              <w:spacing w:after="0" w:line="360" w:lineRule="auto"/>
-              <w:rPr>
-                <w:rFonts w:ascii="Times New Roman" w:eastAsia="Times New Roman" w:hAnsi="Times New Roman" w:cs="Times New Roman"/>
-                <w:kern w:val="0"/>
-                <w14:ligatures w14:val="none"/>
-              </w:rPr>
-            </w:pPr>
-            <w:proofErr w:type="spellStart"/>
-            <w:r>
-              <w:rPr>
-                <w:rFonts w:ascii="Times New Roman" w:eastAsia="Times New Roman" w:hAnsi="Times New Roman" w:cs="Times New Roman"/>
-                <w:kern w:val="0"/>
-                <w14:ligatures w14:val="none"/>
-              </w:rPr>
-              <w:t>Exp</w:t>
-            </w:r>
-            <w:r>
-              <w:rPr>
-                <w:rFonts w:ascii="Times New Roman" w:eastAsia="Times New Roman" w:hAnsi="Times New Roman" w:cs="Times New Roman"/>
-                <w:kern w:val="0"/>
-                <w14:ligatures w14:val="none"/>
-              </w:rPr>
-              <w:t>_</w:t>
-            </w:r>
-            <w:r>
-              <w:rPr>
-                <w:rFonts w:ascii="Times New Roman" w:eastAsia="Times New Roman" w:hAnsi="Times New Roman" w:cs="Times New Roman"/>
-                <w:kern w:val="0"/>
-                <w14:ligatures w14:val="none"/>
-              </w:rPr>
-              <w:t>Repeating</w:t>
-            </w:r>
-            <w:proofErr w:type="spellEnd"/>
-          </w:p>
-        </w:tc>
-        <w:tc>
-          <w:tcPr>
-            <w:tcW w:w="0" w:type="auto"/>
-            <w:tcMar>
-              <w:top w:w="150" w:type="dxa"/>
-              <w:left w:w="240" w:type="dxa"/>
-              <w:bottom w:w="150" w:type="dxa"/>
-              <w:right w:w="240" w:type="dxa"/>
-            </w:tcMar>
-            <w:vAlign w:val="center"/>
-            <w:hideMark/>
-          </w:tcPr>
-          <w:p>
-            <w:pPr>
-              <w:spacing w:after="0" w:line="360" w:lineRule="auto"/>
-              <w:rPr>
-                <w:rFonts w:ascii="Times New Roman" w:eastAsia="Times New Roman" w:hAnsi="Times New Roman" w:cs="Times New Roman"/>
-                <w:kern w:val="0"/>
-                <w14:ligatures w14:val="none"/>
-              </w:rPr>
-            </w:pPr>
-            <w:r>
-              <w:rPr>
-                <w:rFonts w:ascii="Times New Roman" w:eastAsia="Times New Roman" w:hAnsi="Times New Roman" w:cs="Times New Roman"/>
-                <w:kern w:val="0"/>
-                <w14:ligatures w14:val="none"/>
-              </w:rPr>
-              <w:t>BOOLEAN</w:t>
-            </w:r>
+          </w:tcPr>
+          <w:p>
+            <w:pPr>
+              <w:spacing w:after="0" w:line="360" w:lineRule="auto"/>
+              <w:rPr>
+                <w:rFonts w:ascii="Times New Roman" w:eastAsia="Times New Roman" w:hAnsi="Times New Roman" w:cs="Times New Roman"/>
+                <w:kern w:val="0"/>
+                <w14:ligatures w14:val="none"/>
+              </w:rPr>
+            </w:pPr>
+          </w:p>
+        </w:tc>
+        <w:tc>
+          <w:tcPr>
+            <w:tcW w:w="0" w:type="auto"/>
+            <w:tcMar>
+              <w:top w:w="150" w:type="dxa"/>
+              <w:left w:w="240" w:type="dxa"/>
+              <w:bottom w:w="150" w:type="dxa"/>
+              <w:right w:w="240" w:type="dxa"/>
+            </w:tcMar>
+            <w:vAlign w:val="center"/>
+          </w:tcPr>
+          <w:p>
+            <w:pPr>
+              <w:spacing w:after="0" w:line="360" w:lineRule="auto"/>
+              <w:rPr>
+                <w:rFonts w:ascii="Times New Roman" w:eastAsia="Times New Roman" w:hAnsi="Times New Roman" w:cs="Times New Roman"/>
+                <w:kern w:val="0"/>
+                <w14:ligatures w14:val="none"/>
+              </w:rPr>
+            </w:pPr>
           </w:p>
         </w:tc>
         <w:tc>
@@ -2765,25 +2809,16 @@
               <w:right w:w="0" w:type="dxa"/>
             </w:tcMar>
             <w:vAlign w:val="center"/>
-            <w:hideMark/>
-          </w:tcPr>
-          <w:p>
-            <w:pPr>
-              <w:spacing w:after="0" w:line="360" w:lineRule="auto"/>
-              <w:rPr>
-                <w:rFonts w:ascii="Times New Roman" w:eastAsia="Times New Roman" w:hAnsi="Times New Roman" w:cs="Times New Roman"/>
-                <w:kern w:val="0"/>
-                <w14:ligatures w14:val="none"/>
-              </w:rPr>
-            </w:pPr>
-            <w:r>
-              <w:rPr>
-                <w:rFonts w:ascii="Times New Roman" w:eastAsia="Times New Roman" w:hAnsi="Times New Roman" w:cs="Times New Roman"/>
-                <w:kern w:val="0"/>
-                <w14:ligatures w14:val="none"/>
-              </w:rPr>
-              <w:t>Indicates if this is a recurring expense (TRUE/FALSE)</w:t>
-            </w:r>
+          </w:tcPr>
+          <w:p>
+            <w:pPr>
+              <w:spacing w:after="0" w:line="360" w:lineRule="auto"/>
+              <w:rPr>
+                <w:rFonts w:ascii="Times New Roman" w:eastAsia="Times New Roman" w:hAnsi="Times New Roman" w:cs="Times New Roman"/>
+                <w:kern w:val="0"/>
+                <w14:ligatures w14:val="none"/>
+              </w:rPr>
+            </w:pPr>
           </w:p>
         </w:tc>
       </w:tr>
@@ -3184,7 +3219,6 @@
                 <w14:ligatures w14:val="none"/>
               </w:rPr>
             </w:pPr>
-            <w:proofErr w:type="spellStart"/>
             <w:r>
               <w:rPr>
                 <w:rFonts w:ascii="Times New Roman" w:eastAsia="Times New Roman" w:hAnsi="Times New Roman" w:cs="Times New Roman"/>
@@ -3217,7 +3251,6 @@
               </w:rPr>
               <w:t>ame</w:t>
             </w:r>
-            <w:proofErr w:type="spellEnd"/>
           </w:p>
         </w:tc>
         <w:tc>
@@ -3362,13 +3395,23 @@
                 <w14:ligatures w14:val="none"/>
               </w:rPr>
             </w:pPr>
-            <w:r>
-              <w:rPr>
-                <w:rFonts w:ascii="Times New Roman" w:eastAsia="Times New Roman" w:hAnsi="Times New Roman" w:cs="Times New Roman"/>
-                <w:kern w:val="0"/>
-                <w14:ligatures w14:val="none"/>
-              </w:rPr>
-              <w:t>VARCHAR(50)</w:t>
+            <w:proofErr w:type="gramStart"/>
+            <w:r>
+              <w:rPr>
+                <w:rFonts w:ascii="Times New Roman" w:eastAsia="Times New Roman" w:hAnsi="Times New Roman" w:cs="Times New Roman"/>
+                <w:kern w:val="0"/>
+                <w14:ligatures w14:val="none"/>
+              </w:rPr>
+              <w:t>VARCHAR(</w:t>
+            </w:r>
+            <w:proofErr w:type="gramEnd"/>
+            <w:r>
+              <w:rPr>
+                <w:rFonts w:ascii="Times New Roman" w:eastAsia="Times New Roman" w:hAnsi="Times New Roman" w:cs="Times New Roman"/>
+                <w:kern w:val="0"/>
+                <w14:ligatures w14:val="none"/>
+              </w:rPr>
+              <w:t>50)</w:t>
             </w:r>
           </w:p>
         </w:tc>
@@ -3483,13 +3526,23 @@
                 <w14:ligatures w14:val="none"/>
               </w:rPr>
             </w:pPr>
-            <w:r>
-              <w:rPr>
-                <w:rFonts w:ascii="Times New Roman" w:eastAsia="Times New Roman" w:hAnsi="Times New Roman" w:cs="Times New Roman"/>
-                <w:kern w:val="0"/>
-                <w14:ligatures w14:val="none"/>
-              </w:rPr>
-              <w:t>DECIMAL(5,2)</w:t>
+            <w:proofErr w:type="gramStart"/>
+            <w:r>
+              <w:rPr>
+                <w:rFonts w:ascii="Times New Roman" w:eastAsia="Times New Roman" w:hAnsi="Times New Roman" w:cs="Times New Roman"/>
+                <w:kern w:val="0"/>
+                <w14:ligatures w14:val="none"/>
+              </w:rPr>
+              <w:t>DECIMAL(</w:t>
+            </w:r>
+            <w:proofErr w:type="gramEnd"/>
+            <w:r>
+              <w:rPr>
+                <w:rFonts w:ascii="Times New Roman" w:eastAsia="Times New Roman" w:hAnsi="Times New Roman" w:cs="Times New Roman"/>
+                <w:kern w:val="0"/>
+                <w14:ligatures w14:val="none"/>
+              </w:rPr>
+              <w:t>5,2)</w:t>
             </w:r>
           </w:p>
         </w:tc>
@@ -3741,8 +3794,8 @@
       </w:tblPr>
       <w:tblGrid>
         <w:gridCol w:w="3119"/>
-        <w:gridCol w:w="2314"/>
-        <w:gridCol w:w="5847"/>
+        <w:gridCol w:w="2312"/>
+        <w:gridCol w:w="5849"/>
       </w:tblGrid>
       <w:tr>
         <w:trPr>
@@ -4148,13 +4201,23 @@
                 <w14:ligatures w14:val="none"/>
               </w:rPr>
             </w:pPr>
-            <w:r>
-              <w:rPr>
-                <w:rFonts w:ascii="Times New Roman" w:eastAsia="Times New Roman" w:hAnsi="Times New Roman" w:cs="Times New Roman"/>
-                <w:kern w:val="0"/>
-                <w14:ligatures w14:val="none"/>
-              </w:rPr>
-              <w:t>DECIMAL(10,2)</w:t>
+            <w:proofErr w:type="gramStart"/>
+            <w:r>
+              <w:rPr>
+                <w:rFonts w:ascii="Times New Roman" w:eastAsia="Times New Roman" w:hAnsi="Times New Roman" w:cs="Times New Roman"/>
+                <w:kern w:val="0"/>
+                <w14:ligatures w14:val="none"/>
+              </w:rPr>
+              <w:t>DECIMAL(</w:t>
+            </w:r>
+            <w:proofErr w:type="gramEnd"/>
+            <w:r>
+              <w:rPr>
+                <w:rFonts w:ascii="Times New Roman" w:eastAsia="Times New Roman" w:hAnsi="Times New Roman" w:cs="Times New Roman"/>
+                <w:kern w:val="0"/>
+                <w14:ligatures w14:val="none"/>
+              </w:rPr>
+              <w:t>10,2)</w:t>
             </w:r>
           </w:p>
         </w:tc>
@@ -4212,7 +4275,6 @@
                 <w14:ligatures w14:val="none"/>
               </w:rPr>
             </w:pPr>
-            <w:proofErr w:type="spellStart"/>
             <w:r>
               <w:rPr>
                 <w:rFonts w:ascii="Times New Roman" w:eastAsia="Times New Roman" w:hAnsi="Times New Roman" w:cs="Times New Roman"/>
@@ -4229,37 +4291,36 @@
               </w:rPr>
               <w:t>ource</w:t>
             </w:r>
-            <w:proofErr w:type="spellEnd"/>
-          </w:p>
-        </w:tc>
-        <w:tc>
-          <w:tcPr>
-            <w:tcW w:w="0" w:type="auto"/>
-            <w:tcMar>
-              <w:top w:w="150" w:type="dxa"/>
-              <w:left w:w="240" w:type="dxa"/>
-              <w:bottom w:w="150" w:type="dxa"/>
-              <w:right w:w="240" w:type="dxa"/>
-            </w:tcMar>
-            <w:vAlign w:val="center"/>
-            <w:hideMark/>
-          </w:tcPr>
-          <w:p>
-            <w:pPr>
-              <w:spacing w:after="0" w:line="360" w:lineRule="auto"/>
-              <w:rPr>
-                <w:rFonts w:ascii="Times New Roman" w:eastAsia="Times New Roman" w:hAnsi="Times New Roman" w:cs="Times New Roman"/>
-                <w:kern w:val="0"/>
-                <w14:ligatures w14:val="none"/>
-              </w:rPr>
-            </w:pPr>
-            <w:r>
-              <w:rPr>
-                <w:rFonts w:ascii="Times New Roman" w:eastAsia="Times New Roman" w:hAnsi="Times New Roman" w:cs="Times New Roman"/>
-                <w:kern w:val="0"/>
-                <w14:ligatures w14:val="none"/>
-              </w:rPr>
-              <w:t>VARCHAR(100)</w:t>
+          </w:p>
+        </w:tc>
+        <w:tc>
+          <w:tcPr>
+            <w:tcW w:w="0" w:type="auto"/>
+            <w:tcMar>
+              <w:top w:w="150" w:type="dxa"/>
+              <w:left w:w="240" w:type="dxa"/>
+              <w:bottom w:w="150" w:type="dxa"/>
+              <w:right w:w="240" w:type="dxa"/>
+            </w:tcMar>
+            <w:vAlign w:val="center"/>
+            <w:hideMark/>
+          </w:tcPr>
+          <w:p>
+            <w:pPr>
+              <w:spacing w:after="0" w:line="360" w:lineRule="auto"/>
+              <w:rPr>
+                <w:rFonts w:ascii="Times New Roman" w:eastAsia="Times New Roman" w:hAnsi="Times New Roman" w:cs="Times New Roman"/>
+                <w:kern w:val="0"/>
+                <w14:ligatures w14:val="none"/>
+              </w:rPr>
+            </w:pPr>
+            <w:r>
+              <w:rPr>
+                <w:rFonts w:ascii="Times New Roman" w:eastAsia="Times New Roman" w:hAnsi="Times New Roman" w:cs="Times New Roman"/>
+                <w:kern w:val="0"/>
+                <w14:ligatures w14:val="none"/>
+              </w:rPr>
+              <w:t>ENUM</w:t>
             </w:r>
           </w:p>
         </w:tc>
@@ -4829,7 +4890,6 @@
         </w:rPr>
         <w:t xml:space="preserve">Table: </w:t>
       </w:r>
-      <w:proofErr w:type="spellStart"/>
       <w:r>
         <w:rPr>
           <w:rFonts w:ascii="Times New Roman" w:eastAsia="Times New Roman" w:hAnsi="Times New Roman" w:cs="Times New Roman"/>
@@ -4896,7 +4956,6 @@
         </w:rPr>
         <w:t>uggestions</w:t>
       </w:r>
-      <w:proofErr w:type="spellEnd"/>
     </w:p>
     <w:p>
       <w:pPr>
@@ -5573,13 +5632,23 @@
                 <w14:ligatures w14:val="none"/>
               </w:rPr>
             </w:pPr>
-            <w:r>
-              <w:rPr>
-                <w:rFonts w:ascii="Times New Roman" w:eastAsia="Times New Roman" w:hAnsi="Times New Roman" w:cs="Times New Roman"/>
-                <w:kern w:val="0"/>
-                <w14:ligatures w14:val="none"/>
-              </w:rPr>
-              <w:t>DECIMAL(10,2)</w:t>
+            <w:proofErr w:type="gramStart"/>
+            <w:r>
+              <w:rPr>
+                <w:rFonts w:ascii="Times New Roman" w:eastAsia="Times New Roman" w:hAnsi="Times New Roman" w:cs="Times New Roman"/>
+                <w:kern w:val="0"/>
+                <w14:ligatures w14:val="none"/>
+              </w:rPr>
+              <w:t>DECIMAL(</w:t>
+            </w:r>
+            <w:proofErr w:type="gramEnd"/>
+            <w:r>
+              <w:rPr>
+                <w:rFonts w:ascii="Times New Roman" w:eastAsia="Times New Roman" w:hAnsi="Times New Roman" w:cs="Times New Roman"/>
+                <w:kern w:val="0"/>
+                <w14:ligatures w14:val="none"/>
+              </w:rPr>
+              <w:t>10,2)</w:t>
             </w:r>
           </w:p>
         </w:tc>
@@ -7269,13 +7338,23 @@
                 <w14:ligatures w14:val="none"/>
               </w:rPr>
             </w:pPr>
-            <w:r>
-              <w:rPr>
-                <w:rFonts w:ascii="Times New Roman" w:eastAsia="Times New Roman" w:hAnsi="Times New Roman" w:cs="Times New Roman"/>
-                <w:kern w:val="0"/>
-                <w14:ligatures w14:val="none"/>
-              </w:rPr>
-              <w:t>VARCHAR(500)</w:t>
+            <w:proofErr w:type="gramStart"/>
+            <w:r>
+              <w:rPr>
+                <w:rFonts w:ascii="Times New Roman" w:eastAsia="Times New Roman" w:hAnsi="Times New Roman" w:cs="Times New Roman"/>
+                <w:kern w:val="0"/>
+                <w14:ligatures w14:val="none"/>
+              </w:rPr>
+              <w:t>VARCHAR(</w:t>
+            </w:r>
+            <w:proofErr w:type="gramEnd"/>
+            <w:r>
+              <w:rPr>
+                <w:rFonts w:ascii="Times New Roman" w:eastAsia="Times New Roman" w:hAnsi="Times New Roman" w:cs="Times New Roman"/>
+                <w:kern w:val="0"/>
+                <w14:ligatures w14:val="none"/>
+              </w:rPr>
+              <w:t>500)</w:t>
             </w:r>
           </w:p>
         </w:tc>
@@ -7567,7 +7646,6 @@
         <w:lastRenderedPageBreak/>
         <w:t xml:space="preserve">Table: </w:t>
       </w:r>
-      <w:proofErr w:type="spellStart"/>
       <w:r>
         <w:rPr>
           <w:rFonts w:ascii="Times New Roman" w:eastAsia="Times New Roman" w:hAnsi="Times New Roman" w:cs="Times New Roman"/>
@@ -7612,7 +7690,6 @@
         </w:rPr>
         <w:t>udgets</w:t>
       </w:r>
-      <w:proofErr w:type="spellEnd"/>
     </w:p>
     <w:p>
       <w:pPr>
@@ -8250,13 +8327,23 @@
                 <w14:ligatures w14:val="none"/>
               </w:rPr>
             </w:pPr>
-            <w:r>
-              <w:rPr>
-                <w:rFonts w:ascii="Times New Roman" w:eastAsia="Times New Roman" w:hAnsi="Times New Roman" w:cs="Times New Roman"/>
-                <w:kern w:val="0"/>
-                <w14:ligatures w14:val="none"/>
-              </w:rPr>
-              <w:t>DECIMAL(10,2)</w:t>
+            <w:proofErr w:type="gramStart"/>
+            <w:r>
+              <w:rPr>
+                <w:rFonts w:ascii="Times New Roman" w:eastAsia="Times New Roman" w:hAnsi="Times New Roman" w:cs="Times New Roman"/>
+                <w:kern w:val="0"/>
+                <w14:ligatures w14:val="none"/>
+              </w:rPr>
+              <w:t>DECIMAL(</w:t>
+            </w:r>
+            <w:proofErr w:type="gramEnd"/>
+            <w:r>
+              <w:rPr>
+                <w:rFonts w:ascii="Times New Roman" w:eastAsia="Times New Roman" w:hAnsi="Times New Roman" w:cs="Times New Roman"/>
+                <w:kern w:val="0"/>
+                <w14:ligatures w14:val="none"/>
+              </w:rPr>
+              <w:t>10,2)</w:t>
             </w:r>
           </w:p>
         </w:tc>
@@ -8371,13 +8458,23 @@
                 <w14:ligatures w14:val="none"/>
               </w:rPr>
             </w:pPr>
-            <w:r>
-              <w:rPr>
-                <w:rFonts w:ascii="Times New Roman" w:eastAsia="Times New Roman" w:hAnsi="Times New Roman" w:cs="Times New Roman"/>
-                <w:kern w:val="0"/>
-                <w14:ligatures w14:val="none"/>
-              </w:rPr>
-              <w:t>DECIMAL(10,2)</w:t>
+            <w:proofErr w:type="gramStart"/>
+            <w:r>
+              <w:rPr>
+                <w:rFonts w:ascii="Times New Roman" w:eastAsia="Times New Roman" w:hAnsi="Times New Roman" w:cs="Times New Roman"/>
+                <w:kern w:val="0"/>
+                <w14:ligatures w14:val="none"/>
+              </w:rPr>
+              <w:t>DECIMAL(</w:t>
+            </w:r>
+            <w:proofErr w:type="gramEnd"/>
+            <w:r>
+              <w:rPr>
+                <w:rFonts w:ascii="Times New Roman" w:eastAsia="Times New Roman" w:hAnsi="Times New Roman" w:cs="Times New Roman"/>
+                <w:kern w:val="0"/>
+                <w14:ligatures w14:val="none"/>
+              </w:rPr>
+              <w:t>10,2)</w:t>
             </w:r>
           </w:p>
         </w:tc>
@@ -8540,6 +8637,2365 @@
         <w:spacing w:line="360" w:lineRule="auto"/>
         <w:rPr>
           <w:rFonts w:ascii="Times New Roman" w:hAnsi="Times New Roman" w:cs="Times New Roman"/>
+        </w:rPr>
+      </w:pPr>
+    </w:p>
+    <w:p>
+      <w:pPr>
+        <w:rPr>
+          <w:rFonts w:ascii="Times New Roman" w:hAnsi="Times New Roman" w:cs="Times New Roman"/>
+        </w:rPr>
+      </w:pPr>
+      <w:r>
+        <w:rPr>
+          <w:rFonts w:ascii="Times New Roman" w:hAnsi="Times New Roman" w:cs="Times New Roman"/>
+        </w:rPr>
+        <w:br w:type="page"/>
+      </w:r>
+    </w:p>
+    <w:p>
+      <w:pPr>
+        <w:spacing w:line="360" w:lineRule="auto"/>
+        <w:rPr>
+          <w:rFonts w:ascii="Times New Roman" w:hAnsi="Times New Roman" w:cs="Times New Roman"/>
+          <w:b/>
+          <w:bCs/>
+        </w:rPr>
+      </w:pPr>
+      <w:r>
+        <w:rPr>
+          <w:rFonts w:ascii="Times New Roman" w:hAnsi="Times New Roman" w:cs="Times New Roman"/>
+          <w:b/>
+          <w:bCs/>
+        </w:rPr>
+        <w:lastRenderedPageBreak/>
+        <w:t xml:space="preserve">Table </w:t>
+      </w:r>
+      <w:r>
+        <w:rPr>
+          <w:rFonts w:ascii="Times New Roman" w:hAnsi="Times New Roman" w:cs="Times New Roman"/>
+          <w:b/>
+          <w:bCs/>
+          <w:color w:val="FF0000"/>
+        </w:rPr>
+        <w:t>Categories</w:t>
+      </w:r>
+      <w:r>
+        <w:rPr>
+          <w:rFonts w:ascii="Times New Roman" w:hAnsi="Times New Roman" w:cs="Times New Roman"/>
+          <w:b/>
+          <w:bCs/>
+        </w:rPr>
+        <w:t>:</w:t>
+      </w:r>
+    </w:p>
+    <w:p>
+      <w:pPr>
+        <w:spacing w:line="360" w:lineRule="auto"/>
+        <w:rPr>
+          <w:rFonts w:ascii="Times New Roman" w:hAnsi="Times New Roman" w:cs="Times New Roman"/>
+          <w:b/>
+          <w:bCs/>
+          <w:u w:val="single"/>
+        </w:rPr>
+      </w:pPr>
+      <w:r>
+        <w:rPr>
+          <w:rFonts w:ascii="Times New Roman" w:hAnsi="Times New Roman" w:cs="Times New Roman"/>
+          <w:b/>
+          <w:bCs/>
+          <w:highlight w:val="yellow"/>
+          <w:u w:val="single"/>
+        </w:rPr>
+        <w:t>Recommended ENUM Values for Category_Name</w:t>
+      </w:r>
+    </w:p>
+    <w:p>
+      <w:pPr>
+        <w:spacing w:line="360" w:lineRule="auto"/>
+        <w:rPr>
+          <w:rFonts w:ascii="Times New Roman" w:hAnsi="Times New Roman" w:cs="Times New Roman"/>
+        </w:rPr>
+      </w:pPr>
+      <w:r>
+        <w:rPr>
+          <w:rFonts w:ascii="Times New Roman" w:hAnsi="Times New Roman" w:cs="Times New Roman"/>
+        </w:rPr>
+        <w:t>Food &amp; Dining (or Food)</w:t>
+      </w:r>
+      <w:r>
+        <w:rPr>
+          <w:rFonts w:ascii="Times New Roman" w:hAnsi="Times New Roman" w:cs="Times New Roman"/>
+        </w:rPr>
+        <w:t xml:space="preserve"> - </w:t>
+      </w:r>
+      <w:r>
+        <w:rPr>
+          <w:rFonts w:ascii="Times New Roman" w:hAnsi="Times New Roman" w:cs="Times New Roman"/>
+        </w:rPr>
+        <w:t>Transportation (or Transport)</w:t>
+      </w:r>
+      <w:r>
+        <w:rPr>
+          <w:rFonts w:ascii="Times New Roman" w:hAnsi="Times New Roman" w:cs="Times New Roman"/>
+        </w:rPr>
+        <w:t xml:space="preserve"> – </w:t>
+      </w:r>
+      <w:r>
+        <w:rPr>
+          <w:rFonts w:ascii="Times New Roman" w:hAnsi="Times New Roman" w:cs="Times New Roman"/>
+        </w:rPr>
+        <w:t>Shopping</w:t>
+      </w:r>
+      <w:r>
+        <w:rPr>
+          <w:rFonts w:ascii="Times New Roman" w:hAnsi="Times New Roman" w:cs="Times New Roman"/>
+        </w:rPr>
+        <w:t xml:space="preserve"> – </w:t>
+      </w:r>
+      <w:r>
+        <w:rPr>
+          <w:rFonts w:ascii="Times New Roman" w:hAnsi="Times New Roman" w:cs="Times New Roman"/>
+        </w:rPr>
+        <w:t>Entertainment</w:t>
+      </w:r>
+      <w:r>
+        <w:rPr>
+          <w:rFonts w:ascii="Times New Roman" w:hAnsi="Times New Roman" w:cs="Times New Roman"/>
+        </w:rPr>
+        <w:t xml:space="preserve"> - </w:t>
+      </w:r>
+      <w:r>
+        <w:rPr>
+          <w:rFonts w:ascii="Times New Roman" w:hAnsi="Times New Roman" w:cs="Times New Roman"/>
+        </w:rPr>
+        <w:t>Bills &amp; Utilities (or Utilities)</w:t>
+      </w:r>
+      <w:r>
+        <w:rPr>
+          <w:rFonts w:ascii="Times New Roman" w:hAnsi="Times New Roman" w:cs="Times New Roman"/>
+        </w:rPr>
+        <w:t xml:space="preserve"> - </w:t>
+      </w:r>
+      <w:r>
+        <w:rPr>
+          <w:rFonts w:ascii="Times New Roman" w:hAnsi="Times New Roman" w:cs="Times New Roman"/>
+        </w:rPr>
+        <w:t>Rent / Mortgage (or Housing)</w:t>
+      </w:r>
+      <w:r>
+        <w:rPr>
+          <w:rFonts w:ascii="Times New Roman" w:hAnsi="Times New Roman" w:cs="Times New Roman"/>
+        </w:rPr>
+        <w:t xml:space="preserve"> - </w:t>
+      </w:r>
+      <w:r>
+        <w:rPr>
+          <w:rFonts w:ascii="Times New Roman" w:hAnsi="Times New Roman" w:cs="Times New Roman"/>
+        </w:rPr>
+        <w:t>Healthcare (or Health)</w:t>
+      </w:r>
+      <w:r>
+        <w:rPr>
+          <w:rFonts w:ascii="Times New Roman" w:hAnsi="Times New Roman" w:cs="Times New Roman"/>
+        </w:rPr>
+        <w:t xml:space="preserve"> – </w:t>
+      </w:r>
+      <w:r>
+        <w:rPr>
+          <w:rFonts w:ascii="Times New Roman" w:hAnsi="Times New Roman" w:cs="Times New Roman"/>
+        </w:rPr>
+        <w:t>Education</w:t>
+      </w:r>
+      <w:r>
+        <w:rPr>
+          <w:rFonts w:ascii="Times New Roman" w:hAnsi="Times New Roman" w:cs="Times New Roman"/>
+        </w:rPr>
+        <w:t xml:space="preserve"> – </w:t>
+      </w:r>
+      <w:r>
+        <w:rPr>
+          <w:rFonts w:ascii="Times New Roman" w:hAnsi="Times New Roman" w:cs="Times New Roman"/>
+        </w:rPr>
+        <w:t>Travel</w:t>
+      </w:r>
+      <w:r>
+        <w:rPr>
+          <w:rFonts w:ascii="Times New Roman" w:hAnsi="Times New Roman" w:cs="Times New Roman"/>
+        </w:rPr>
+        <w:t xml:space="preserve"> - </w:t>
+      </w:r>
+      <w:r>
+        <w:rPr>
+          <w:rFonts w:ascii="Times New Roman" w:hAnsi="Times New Roman" w:cs="Times New Roman"/>
+        </w:rPr>
+        <w:t>Personal Care</w:t>
+      </w:r>
+      <w:r>
+        <w:rPr>
+          <w:rFonts w:ascii="Times New Roman" w:hAnsi="Times New Roman" w:cs="Times New Roman"/>
+        </w:rPr>
+        <w:t xml:space="preserve"> - </w:t>
+      </w:r>
+      <w:r>
+        <w:rPr>
+          <w:rFonts w:ascii="Times New Roman" w:hAnsi="Times New Roman" w:cs="Times New Roman"/>
+        </w:rPr>
+        <w:t xml:space="preserve">Groceries </w:t>
+      </w:r>
+      <w:r>
+        <w:rPr>
+          <w:rFonts w:ascii="Times New Roman" w:hAnsi="Times New Roman" w:cs="Times New Roman"/>
+        </w:rPr>
+        <w:t xml:space="preserve">- </w:t>
+      </w:r>
+      <w:r>
+        <w:rPr>
+          <w:rFonts w:ascii="Times New Roman" w:hAnsi="Times New Roman" w:cs="Times New Roman"/>
+        </w:rPr>
+        <w:t>Fast Food</w:t>
+      </w:r>
+      <w:r>
+        <w:rPr>
+          <w:rFonts w:ascii="Times New Roman" w:hAnsi="Times New Roman" w:cs="Times New Roman"/>
+        </w:rPr>
+        <w:t xml:space="preserve"> - </w:t>
+      </w:r>
+      <w:r>
+        <w:rPr>
+          <w:rFonts w:ascii="Times New Roman" w:hAnsi="Times New Roman" w:cs="Times New Roman"/>
+        </w:rPr>
+        <w:t>Alcohol &amp; Bars</w:t>
+      </w:r>
+      <w:r>
+        <w:rPr>
+          <w:rFonts w:ascii="Times New Roman" w:hAnsi="Times New Roman" w:cs="Times New Roman"/>
+        </w:rPr>
+        <w:t xml:space="preserve"> - </w:t>
+      </w:r>
+      <w:r>
+        <w:rPr>
+          <w:rFonts w:ascii="Times New Roman" w:hAnsi="Times New Roman" w:cs="Times New Roman"/>
+        </w:rPr>
+        <w:t>Gas &amp; Fuel</w:t>
+      </w:r>
+      <w:r>
+        <w:rPr>
+          <w:rFonts w:ascii="Times New Roman" w:hAnsi="Times New Roman" w:cs="Times New Roman"/>
+        </w:rPr>
+        <w:t xml:space="preserve"> – </w:t>
+      </w:r>
+      <w:r>
+        <w:rPr>
+          <w:rFonts w:ascii="Times New Roman" w:hAnsi="Times New Roman" w:cs="Times New Roman"/>
+        </w:rPr>
+        <w:t>Parking</w:t>
+      </w:r>
+      <w:r>
+        <w:rPr>
+          <w:rFonts w:ascii="Times New Roman" w:hAnsi="Times New Roman" w:cs="Times New Roman"/>
+        </w:rPr>
+        <w:t xml:space="preserve"> – </w:t>
+      </w:r>
+      <w:r>
+        <w:rPr>
+          <w:rFonts w:ascii="Times New Roman" w:hAnsi="Times New Roman" w:cs="Times New Roman"/>
+        </w:rPr>
+        <w:t>Clothing</w:t>
+      </w:r>
+      <w:r>
+        <w:rPr>
+          <w:rFonts w:ascii="Times New Roman" w:hAnsi="Times New Roman" w:cs="Times New Roman"/>
+        </w:rPr>
+        <w:t xml:space="preserve"> – </w:t>
+      </w:r>
+      <w:r>
+        <w:rPr>
+          <w:rFonts w:ascii="Times New Roman" w:hAnsi="Times New Roman" w:cs="Times New Roman"/>
+        </w:rPr>
+        <w:t>Electronics</w:t>
+      </w:r>
+      <w:r>
+        <w:rPr>
+          <w:rFonts w:ascii="Times New Roman" w:hAnsi="Times New Roman" w:cs="Times New Roman"/>
+        </w:rPr>
+        <w:t xml:space="preserve"> - </w:t>
+      </w:r>
+      <w:r>
+        <w:rPr>
+          <w:rFonts w:ascii="Times New Roman" w:hAnsi="Times New Roman" w:cs="Times New Roman"/>
+        </w:rPr>
+        <w:t>Gifts &amp; Donations</w:t>
+      </w:r>
+      <w:r>
+        <w:rPr>
+          <w:rFonts w:ascii="Times New Roman" w:hAnsi="Times New Roman" w:cs="Times New Roman"/>
+        </w:rPr>
+        <w:t xml:space="preserve"> - </w:t>
+      </w:r>
+      <w:r>
+        <w:rPr>
+          <w:rFonts w:ascii="Times New Roman" w:hAnsi="Times New Roman" w:cs="Times New Roman"/>
+        </w:rPr>
+        <w:t>Subscriptions (Netflix, Spotify, etc.)</w:t>
+      </w:r>
+      <w:r>
+        <w:rPr>
+          <w:rFonts w:ascii="Times New Roman" w:hAnsi="Times New Roman" w:cs="Times New Roman"/>
+        </w:rPr>
+        <w:t xml:space="preserve"> - </w:t>
+      </w:r>
+      <w:r>
+        <w:rPr>
+          <w:rFonts w:ascii="Times New Roman" w:hAnsi="Times New Roman" w:cs="Times New Roman"/>
+        </w:rPr>
+        <w:t>Phone &amp; Internet</w:t>
+      </w:r>
+      <w:r>
+        <w:rPr>
+          <w:rFonts w:ascii="Times New Roman" w:hAnsi="Times New Roman" w:cs="Times New Roman"/>
+        </w:rPr>
+        <w:t xml:space="preserve"> – </w:t>
+      </w:r>
+      <w:r>
+        <w:rPr>
+          <w:rFonts w:ascii="Times New Roman" w:hAnsi="Times New Roman" w:cs="Times New Roman"/>
+        </w:rPr>
+        <w:t>Insurance</w:t>
+      </w:r>
+      <w:r>
+        <w:rPr>
+          <w:rFonts w:ascii="Times New Roman" w:hAnsi="Times New Roman" w:cs="Times New Roman"/>
+        </w:rPr>
+        <w:t xml:space="preserve"> – </w:t>
+      </w:r>
+      <w:r>
+        <w:rPr>
+          <w:rFonts w:ascii="Times New Roman" w:hAnsi="Times New Roman" w:cs="Times New Roman"/>
+        </w:rPr>
+        <w:t>Childcare</w:t>
+      </w:r>
+      <w:r>
+        <w:rPr>
+          <w:rFonts w:ascii="Times New Roman" w:hAnsi="Times New Roman" w:cs="Times New Roman"/>
+        </w:rPr>
+        <w:t xml:space="preserve"> – </w:t>
+      </w:r>
+      <w:r>
+        <w:rPr>
+          <w:rFonts w:ascii="Times New Roman" w:hAnsi="Times New Roman" w:cs="Times New Roman"/>
+        </w:rPr>
+        <w:t>Pets</w:t>
+      </w:r>
+      <w:r>
+        <w:rPr>
+          <w:rFonts w:ascii="Times New Roman" w:hAnsi="Times New Roman" w:cs="Times New Roman"/>
+        </w:rPr>
+        <w:t xml:space="preserve"> - </w:t>
+      </w:r>
+      <w:r>
+        <w:rPr>
+          <w:rFonts w:ascii="Times New Roman" w:hAnsi="Times New Roman" w:cs="Times New Roman"/>
+        </w:rPr>
+        <w:t>Fitness (Gym memberships)</w:t>
+      </w:r>
+      <w:r>
+        <w:rPr>
+          <w:rFonts w:ascii="Times New Roman" w:hAnsi="Times New Roman" w:cs="Times New Roman"/>
+        </w:rPr>
+        <w:t xml:space="preserve"> - </w:t>
+      </w:r>
+      <w:r>
+        <w:rPr>
+          <w:rFonts w:ascii="Times New Roman" w:hAnsi="Times New Roman" w:cs="Times New Roman"/>
+        </w:rPr>
+        <w:t>Home Improvement</w:t>
+      </w:r>
+      <w:r>
+        <w:rPr>
+          <w:rFonts w:ascii="Times New Roman" w:hAnsi="Times New Roman" w:cs="Times New Roman"/>
+        </w:rPr>
+        <w:t xml:space="preserve"> - </w:t>
+      </w:r>
+      <w:r>
+        <w:rPr>
+          <w:rFonts w:ascii="Times New Roman" w:hAnsi="Times New Roman" w:cs="Times New Roman"/>
+        </w:rPr>
+        <w:t>Office Supplies</w:t>
+      </w:r>
+      <w:r>
+        <w:rPr>
+          <w:rFonts w:ascii="Times New Roman" w:hAnsi="Times New Roman" w:cs="Times New Roman"/>
+        </w:rPr>
+        <w:t xml:space="preserve"> – other …</w:t>
+      </w:r>
+    </w:p>
+    <w:p>
+      <w:pPr>
+        <w:spacing w:line="360" w:lineRule="auto"/>
+        <w:rPr>
+          <w:rFonts w:ascii="Times New Roman" w:hAnsi="Times New Roman" w:cs="Times New Roman"/>
+        </w:rPr>
+      </w:pPr>
+    </w:p>
+    <w:p>
+      <w:pPr>
+        <w:spacing w:line="360" w:lineRule="auto"/>
+        <w:rPr>
+          <w:rFonts w:ascii="Times New Roman" w:hAnsi="Times New Roman" w:cs="Times New Roman"/>
+          <w:b/>
+          <w:bCs/>
+        </w:rPr>
+      </w:pPr>
+      <w:r>
+        <w:rPr>
+          <w:rFonts w:ascii="Times New Roman" w:hAnsi="Times New Roman" w:cs="Times New Roman"/>
+          <w:b/>
+          <w:bCs/>
+        </w:rPr>
+        <w:t xml:space="preserve">Table </w:t>
+      </w:r>
+      <w:r>
+        <w:rPr>
+          <w:rFonts w:ascii="Times New Roman" w:hAnsi="Times New Roman" w:cs="Times New Roman"/>
+          <w:b/>
+          <w:bCs/>
+          <w:color w:val="FF0000"/>
+        </w:rPr>
+        <w:t>Incomes</w:t>
+      </w:r>
+      <w:r>
+        <w:rPr>
+          <w:rFonts w:ascii="Times New Roman" w:hAnsi="Times New Roman" w:cs="Times New Roman"/>
+          <w:b/>
+          <w:bCs/>
+        </w:rPr>
+        <w:t>:</w:t>
+      </w:r>
+    </w:p>
+    <w:p>
+      <w:pPr>
+        <w:spacing w:line="360" w:lineRule="auto"/>
+        <w:rPr>
+          <w:rFonts w:ascii="Times New Roman" w:hAnsi="Times New Roman" w:cs="Times New Roman"/>
+          <w:b/>
+          <w:bCs/>
+          <w:u w:val="single"/>
+        </w:rPr>
+      </w:pPr>
+      <w:r>
+        <w:rPr>
+          <w:rFonts w:ascii="Times New Roman" w:hAnsi="Times New Roman" w:cs="Times New Roman"/>
+          <w:b/>
+          <w:bCs/>
+          <w:highlight w:val="yellow"/>
+          <w:u w:val="single"/>
+        </w:rPr>
+        <w:t xml:space="preserve">Recommended ENUM Values </w:t>
+      </w:r>
+      <w:r>
+        <w:rPr>
+          <w:rFonts w:ascii="Times New Roman" w:hAnsi="Times New Roman" w:cs="Times New Roman"/>
+          <w:b/>
+          <w:bCs/>
+          <w:highlight w:val="yellow"/>
+          <w:u w:val="single"/>
+        </w:rPr>
+        <w:t xml:space="preserve">for </w:t>
+      </w:r>
+      <w:r>
+        <w:rPr>
+          <w:rFonts w:ascii="Times New Roman" w:hAnsi="Times New Roman" w:cs="Times New Roman"/>
+          <w:b/>
+          <w:bCs/>
+          <w:highlight w:val="yellow"/>
+          <w:u w:val="single"/>
+        </w:rPr>
+        <w:t>Income_Source</w:t>
+      </w:r>
+    </w:p>
+    <w:p>
+      <w:pPr>
+        <w:spacing w:line="360" w:lineRule="auto"/>
+        <w:rPr>
+          <w:rFonts w:ascii="Times New Roman" w:hAnsi="Times New Roman" w:cs="Times New Roman"/>
+        </w:rPr>
+      </w:pPr>
+      <w:r>
+        <w:rPr>
+          <w:rFonts w:ascii="Times New Roman" w:hAnsi="Times New Roman" w:cs="Times New Roman"/>
+        </w:rPr>
+        <w:t>Salary</w:t>
+      </w:r>
+      <w:r>
+        <w:rPr>
+          <w:rFonts w:ascii="Times New Roman" w:hAnsi="Times New Roman" w:cs="Times New Roman"/>
+        </w:rPr>
+        <w:t xml:space="preserve"> – Wages – Self-Employed – Business – Freelance – Investment – Rental Income – Lottery – Interest – Bonus – Commission – Tips – Gift – Refund – Reimbursement – Government Benefits – Unemployment – Child Support – Pension – Social Security – Scholarship – Student Loan – Side Hustle – Other.</w:t>
+      </w:r>
+    </w:p>
+    <w:p>
+      <w:pPr>
+        <w:spacing w:line="360" w:lineRule="auto"/>
+        <w:rPr>
+          <w:rFonts w:ascii="Times New Roman" w:hAnsi="Times New Roman" w:cs="Times New Roman"/>
+        </w:rPr>
+      </w:pPr>
+    </w:p>
+    <w:p>
+      <w:pPr>
+        <w:spacing w:line="360" w:lineRule="auto"/>
+        <w:rPr>
+          <w:rFonts w:ascii="Times New Roman" w:hAnsi="Times New Roman" w:cs="Times New Roman"/>
+        </w:rPr>
+      </w:pPr>
+    </w:p>
+    <w:p>
+      <w:pPr>
+        <w:spacing w:line="360" w:lineRule="auto"/>
+        <w:rPr>
+          <w:rFonts w:ascii="Times New Roman" w:hAnsi="Times New Roman" w:cs="Times New Roman"/>
+        </w:rPr>
+      </w:pPr>
+    </w:p>
+    <w:p>
+      <w:pPr>
+        <w:spacing w:line="360" w:lineRule="auto"/>
+        <w:rPr>
+          <w:rFonts w:ascii="Times New Roman" w:hAnsi="Times New Roman" w:cs="Times New Roman"/>
+        </w:rPr>
+      </w:pPr>
+    </w:p>
+    <w:p>
+      <w:pPr>
+        <w:spacing w:line="360" w:lineRule="auto"/>
+        <w:rPr>
+          <w:rFonts w:ascii="Times New Roman" w:hAnsi="Times New Roman" w:cs="Times New Roman"/>
+        </w:rPr>
+      </w:pPr>
+    </w:p>
+    <w:p>
+      <w:pPr>
+        <w:spacing w:line="360" w:lineRule="auto"/>
+        <w:rPr>
+          <w:rFonts w:ascii="Times New Roman" w:hAnsi="Times New Roman" w:cs="Times New Roman"/>
+        </w:rPr>
+      </w:pPr>
+    </w:p>
+    <w:p>
+      <w:pPr>
+        <w:spacing w:line="360" w:lineRule="auto"/>
+        <w:rPr>
+          <w:rFonts w:ascii="Times New Roman" w:hAnsi="Times New Roman" w:cs="Times New Roman"/>
+        </w:rPr>
+      </w:pPr>
+    </w:p>
+    <w:p>
+      <w:pPr>
+        <w:spacing w:line="360" w:lineRule="auto"/>
+        <w:rPr>
+          <w:rFonts w:ascii="Times New Roman" w:hAnsi="Times New Roman" w:cs="Times New Roman"/>
+        </w:rPr>
+      </w:pPr>
+    </w:p>
+    <w:p>
+      <w:pPr>
+        <w:spacing w:line="360" w:lineRule="auto"/>
+        <w:rPr>
+          <w:rFonts w:ascii="Times New Roman" w:hAnsi="Times New Roman" w:cs="Times New Roman"/>
+        </w:rPr>
+      </w:pPr>
+    </w:p>
+    <w:p>
+      <w:pPr>
+        <w:spacing w:line="360" w:lineRule="auto"/>
+        <w:rPr>
+          <w:rFonts w:ascii="Times New Roman" w:hAnsi="Times New Roman" w:cs="Times New Roman"/>
+        </w:rPr>
+      </w:pPr>
+    </w:p>
+    <w:p>
+      <w:pPr>
+        <w:spacing w:line="360" w:lineRule="auto"/>
+        <w:rPr>
+          <w:rFonts w:ascii="Times New Roman" w:hAnsi="Times New Roman" w:cs="Times New Roman"/>
+        </w:rPr>
+      </w:pPr>
+    </w:p>
+    <w:p>
+      <w:pPr>
+        <w:spacing w:line="360" w:lineRule="auto"/>
+        <w:rPr>
+          <w:rFonts w:ascii="Times New Roman" w:hAnsi="Times New Roman" w:cs="Times New Roman"/>
+        </w:rPr>
+      </w:pPr>
+    </w:p>
+    <w:p>
+      <w:pPr>
+        <w:spacing w:line="360" w:lineRule="auto"/>
+        <w:rPr>
+          <w:rFonts w:ascii="Times New Roman" w:hAnsi="Times New Roman" w:cs="Times New Roman"/>
+          <w:color w:val="0F1115"/>
+          <w:shd w:val="clear" w:color="auto" w:fill="FFFFFF"/>
+        </w:rPr>
+      </w:pPr>
+      <w:r>
+        <w:rPr>
+          <w:rStyle w:val="Strong"/>
+          <w:rFonts w:ascii="Times New Roman" w:hAnsi="Times New Roman" w:cs="Times New Roman"/>
+          <w:b w:val="0"/>
+          <w:bCs w:val="0"/>
+          <w:color w:val="0F1115"/>
+          <w:shd w:val="clear" w:color="auto" w:fill="FFFFFF"/>
+        </w:rPr>
+        <w:t xml:space="preserve">The </w:t>
+      </w:r>
+      <w:r>
+        <w:rPr>
+          <w:rStyle w:val="Strong"/>
+          <w:rFonts w:ascii="Times New Roman" w:hAnsi="Times New Roman" w:cs="Times New Roman"/>
+          <w:b w:val="0"/>
+          <w:bCs w:val="0"/>
+          <w:color w:val="0F1115"/>
+          <w:shd w:val="clear" w:color="auto" w:fill="FFFFFF"/>
+        </w:rPr>
+        <w:t>relationships</w:t>
+      </w:r>
+      <w:r>
+        <w:rPr>
+          <w:rFonts w:ascii="Times New Roman" w:hAnsi="Times New Roman" w:cs="Times New Roman"/>
+          <w:color w:val="0F1115"/>
+          <w:shd w:val="clear" w:color="auto" w:fill="FFFFFF"/>
+        </w:rPr>
+        <w:t xml:space="preserve"> between the tables, </w:t>
+      </w:r>
+      <w:r>
+        <w:rPr>
+          <w:rFonts w:ascii="Times New Roman" w:hAnsi="Times New Roman" w:cs="Times New Roman"/>
+          <w:color w:val="0F1115"/>
+          <w:shd w:val="clear" w:color="auto" w:fill="FFFFFF"/>
+        </w:rPr>
+        <w:t>with a clear description</w:t>
+      </w:r>
+      <w:r>
+        <w:rPr>
+          <w:rFonts w:ascii="Times New Roman" w:hAnsi="Times New Roman" w:cs="Times New Roman"/>
+          <w:color w:val="0F1115"/>
+          <w:shd w:val="clear" w:color="auto" w:fill="FFFFFF"/>
+        </w:rPr>
+        <w:t>:</w:t>
+      </w:r>
+    </w:p>
+    <w:tbl>
+      <w:tblPr>
+        <w:tblW w:w="11245" w:type="dxa"/>
+        <w:tblBorders>
+          <w:top w:val="single" w:sz="4" w:space="0" w:color="auto"/>
+          <w:left w:val="single" w:sz="4" w:space="0" w:color="auto"/>
+          <w:bottom w:val="single" w:sz="4" w:space="0" w:color="auto"/>
+          <w:right w:val="single" w:sz="4" w:space="0" w:color="auto"/>
+          <w:insideH w:val="single" w:sz="4" w:space="0" w:color="auto"/>
+          <w:insideV w:val="single" w:sz="4" w:space="0" w:color="auto"/>
+        </w:tblBorders>
+        <w:shd w:val="clear" w:color="auto" w:fill="FFFFFF"/>
+        <w:tblCellMar>
+          <w:top w:w="15" w:type="dxa"/>
+          <w:left w:w="15" w:type="dxa"/>
+          <w:bottom w:w="15" w:type="dxa"/>
+          <w:right w:w="15" w:type="dxa"/>
+        </w:tblCellMar>
+        <w:tblLook w:val="04A0" w:firstRow="1" w:lastRow="0" w:firstColumn="1" w:lastColumn="0" w:noHBand="0" w:noVBand="1"/>
+      </w:tblPr>
+      <w:tblGrid>
+        <w:gridCol w:w="1627"/>
+        <w:gridCol w:w="2778"/>
+        <w:gridCol w:w="1980"/>
+        <w:gridCol w:w="4860"/>
+      </w:tblGrid>
+      <w:tr>
+        <w:trPr>
+          <w:gridAfter w:val="1"/>
+          <w:wAfter w:w="4860" w:type="dxa"/>
+          <w:tblHeader/>
+        </w:trPr>
+        <w:tc>
+          <w:tcPr>
+            <w:tcW w:w="1627" w:type="dxa"/>
+            <w:shd w:val="clear" w:color="auto" w:fill="FFFFFF"/>
+            <w:tcMar>
+              <w:top w:w="150" w:type="dxa"/>
+              <w:left w:w="240" w:type="dxa"/>
+              <w:bottom w:w="150" w:type="dxa"/>
+              <w:right w:w="240" w:type="dxa"/>
+            </w:tcMar>
+            <w:vAlign w:val="center"/>
+            <w:hideMark/>
+          </w:tcPr>
+          <w:p>
+            <w:pPr>
+              <w:spacing w:after="0" w:line="375" w:lineRule="atLeast"/>
+              <w:rPr>
+                <w:rFonts w:ascii="Segoe UI" w:eastAsia="Times New Roman" w:hAnsi="Segoe UI" w:cs="Segoe UI"/>
+                <w:color w:val="0F1115"/>
+                <w:kern w:val="0"/>
+                <w:sz w:val="23"/>
+                <w:szCs w:val="23"/>
+                <w14:ligatures w14:val="none"/>
+              </w:rPr>
+            </w:pPr>
+            <w:r>
+              <w:rPr>
+                <w:rFonts w:ascii="Segoe UI" w:eastAsia="Times New Roman" w:hAnsi="Segoe UI" w:cs="Segoe UI"/>
+                <w:color w:val="0F1115"/>
+                <w:kern w:val="0"/>
+                <w:sz w:val="23"/>
+                <w:szCs w:val="23"/>
+                <w14:ligatures w14:val="none"/>
+              </w:rPr>
+              <w:t xml:space="preserve">Table </w:t>
+            </w:r>
+          </w:p>
+        </w:tc>
+        <w:tc>
+          <w:tcPr>
+            <w:tcW w:w="2778" w:type="dxa"/>
+            <w:shd w:val="clear" w:color="auto" w:fill="FFFFFF"/>
+            <w:tcMar>
+              <w:top w:w="150" w:type="dxa"/>
+              <w:left w:w="240" w:type="dxa"/>
+              <w:bottom w:w="150" w:type="dxa"/>
+              <w:right w:w="240" w:type="dxa"/>
+            </w:tcMar>
+            <w:vAlign w:val="center"/>
+            <w:hideMark/>
+          </w:tcPr>
+          <w:p>
+            <w:pPr>
+              <w:spacing w:after="0" w:line="375" w:lineRule="atLeast"/>
+              <w:rPr>
+                <w:rFonts w:ascii="Segoe UI" w:eastAsia="Times New Roman" w:hAnsi="Segoe UI" w:cs="Segoe UI"/>
+                <w:color w:val="0F1115"/>
+                <w:kern w:val="0"/>
+                <w:sz w:val="23"/>
+                <w:szCs w:val="23"/>
+                <w14:ligatures w14:val="none"/>
+              </w:rPr>
+            </w:pPr>
+            <w:r>
+              <w:rPr>
+                <w:rFonts w:ascii="Segoe UI" w:eastAsia="Times New Roman" w:hAnsi="Segoe UI" w:cs="Segoe UI"/>
+                <w:color w:val="0F1115"/>
+                <w:kern w:val="0"/>
+                <w:sz w:val="23"/>
+                <w:szCs w:val="23"/>
+                <w14:ligatures w14:val="none"/>
+              </w:rPr>
+              <w:t xml:space="preserve">Relationship </w:t>
+            </w:r>
+            <w:r>
+              <w:rPr>
+                <w:rFonts w:ascii="Segoe UI" w:eastAsia="Times New Roman" w:hAnsi="Segoe UI" w:cs="Segoe UI"/>
+                <w:color w:val="0F1115"/>
+                <w:kern w:val="0"/>
+                <w:sz w:val="23"/>
+                <w:szCs w:val="23"/>
+                <w14:ligatures w14:val="none"/>
+              </w:rPr>
+              <w:t>with</w:t>
+            </w:r>
+          </w:p>
+        </w:tc>
+        <w:tc>
+          <w:tcPr>
+            <w:tcW w:w="1980" w:type="dxa"/>
+            <w:shd w:val="clear" w:color="auto" w:fill="FFFFFF"/>
+            <w:tcMar>
+              <w:top w:w="150" w:type="dxa"/>
+              <w:left w:w="240" w:type="dxa"/>
+              <w:bottom w:w="150" w:type="dxa"/>
+              <w:right w:w="240" w:type="dxa"/>
+            </w:tcMar>
+            <w:vAlign w:val="center"/>
+            <w:hideMark/>
+          </w:tcPr>
+          <w:p>
+            <w:pPr>
+              <w:spacing w:after="0" w:line="375" w:lineRule="atLeast"/>
+              <w:rPr>
+                <w:rFonts w:ascii="Segoe UI" w:eastAsia="Times New Roman" w:hAnsi="Segoe UI" w:cs="Segoe UI"/>
+                <w:color w:val="0F1115"/>
+                <w:kern w:val="0"/>
+                <w:sz w:val="23"/>
+                <w:szCs w:val="23"/>
+                <w14:ligatures w14:val="none"/>
+              </w:rPr>
+            </w:pPr>
+            <w:r>
+              <w:rPr>
+                <w:rFonts w:ascii="Segoe UI" w:eastAsia="Times New Roman" w:hAnsi="Segoe UI" w:cs="Segoe UI"/>
+                <w:color w:val="0F1115"/>
+                <w:kern w:val="0"/>
+                <w:sz w:val="23"/>
+                <w:szCs w:val="23"/>
+                <w14:ligatures w14:val="none"/>
+              </w:rPr>
+              <w:t>Description</w:t>
+            </w:r>
+          </w:p>
+        </w:tc>
+      </w:tr>
+      <w:tr>
+        <w:tc>
+          <w:tcPr>
+            <w:tcW w:w="1627" w:type="dxa"/>
+            <w:shd w:val="clear" w:color="auto" w:fill="FFFFFF"/>
+            <w:tcMar>
+              <w:top w:w="150" w:type="dxa"/>
+              <w:left w:w="240" w:type="dxa"/>
+              <w:bottom w:w="150" w:type="dxa"/>
+              <w:right w:w="240" w:type="dxa"/>
+            </w:tcMar>
+            <w:vAlign w:val="center"/>
+            <w:hideMark/>
+          </w:tcPr>
+          <w:p>
+            <w:pPr>
+              <w:spacing w:after="0" w:line="375" w:lineRule="atLeast"/>
+              <w:rPr>
+                <w:rFonts w:ascii="Segoe UI" w:eastAsia="Times New Roman" w:hAnsi="Segoe UI" w:cs="Segoe UI"/>
+                <w:color w:val="0F1115"/>
+                <w:kern w:val="0"/>
+                <w:sz w:val="23"/>
+                <w:szCs w:val="23"/>
+                <w14:ligatures w14:val="none"/>
+              </w:rPr>
+            </w:pPr>
+            <w:r>
+              <w:rPr>
+                <w:rFonts w:ascii="Segoe UI" w:eastAsia="Times New Roman" w:hAnsi="Segoe UI" w:cs="Segoe UI"/>
+                <w:b/>
+                <w:bCs/>
+                <w:color w:val="0F1115"/>
+                <w:kern w:val="0"/>
+                <w:sz w:val="23"/>
+                <w:szCs w:val="23"/>
+                <w14:ligatures w14:val="none"/>
+              </w:rPr>
+              <w:t>Users</w:t>
+            </w:r>
+          </w:p>
+        </w:tc>
+        <w:tc>
+          <w:tcPr>
+            <w:tcW w:w="2778" w:type="dxa"/>
+            <w:shd w:val="clear" w:color="auto" w:fill="FFFFFF"/>
+            <w:tcMar>
+              <w:top w:w="150" w:type="dxa"/>
+              <w:left w:w="240" w:type="dxa"/>
+              <w:bottom w:w="150" w:type="dxa"/>
+              <w:right w:w="240" w:type="dxa"/>
+            </w:tcMar>
+            <w:vAlign w:val="center"/>
+            <w:hideMark/>
+          </w:tcPr>
+          <w:p>
+            <w:pPr>
+              <w:spacing w:after="0" w:line="375" w:lineRule="atLeast"/>
+              <w:rPr>
+                <w:rFonts w:ascii="Segoe UI" w:eastAsia="Times New Roman" w:hAnsi="Segoe UI" w:cs="Segoe UI"/>
+                <w:color w:val="0F1115"/>
+                <w:kern w:val="0"/>
+                <w:sz w:val="23"/>
+                <w:szCs w:val="23"/>
+                <w14:ligatures w14:val="none"/>
+              </w:rPr>
+            </w:pPr>
+            <w:r>
+              <w:rPr>
+                <w:rFonts w:ascii="Segoe UI" w:eastAsia="Times New Roman" w:hAnsi="Segoe UI" w:cs="Segoe UI"/>
+                <w:b/>
+                <w:bCs/>
+                <w:color w:val="0F1115"/>
+                <w:kern w:val="0"/>
+                <w:sz w:val="23"/>
+                <w:szCs w:val="23"/>
+                <w14:ligatures w14:val="none"/>
+              </w:rPr>
+              <w:t>Expenses</w:t>
+            </w:r>
+          </w:p>
+        </w:tc>
+        <w:tc>
+          <w:tcPr>
+            <w:tcW w:w="1980" w:type="dxa"/>
+            <w:shd w:val="clear" w:color="auto" w:fill="FFFFFF"/>
+            <w:tcMar>
+              <w:top w:w="150" w:type="dxa"/>
+              <w:left w:w="240" w:type="dxa"/>
+              <w:bottom w:w="150" w:type="dxa"/>
+              <w:right w:w="240" w:type="dxa"/>
+            </w:tcMar>
+            <w:vAlign w:val="center"/>
+            <w:hideMark/>
+          </w:tcPr>
+          <w:p>
+            <w:pPr>
+              <w:spacing w:after="0" w:line="375" w:lineRule="atLeast"/>
+              <w:rPr>
+                <w:rFonts w:ascii="Segoe UI" w:eastAsia="Times New Roman" w:hAnsi="Segoe UI" w:cs="Segoe UI"/>
+                <w:color w:val="0F1115"/>
+                <w:kern w:val="0"/>
+                <w:sz w:val="23"/>
+                <w:szCs w:val="23"/>
+                <w14:ligatures w14:val="none"/>
+              </w:rPr>
+            </w:pPr>
+            <w:r>
+              <w:rPr>
+                <w:rFonts w:ascii="Segoe UI" w:eastAsia="Times New Roman" w:hAnsi="Segoe UI" w:cs="Segoe UI"/>
+                <w:color w:val="0F1115"/>
+                <w:kern w:val="0"/>
+                <w:sz w:val="23"/>
+                <w:szCs w:val="23"/>
+                <w14:ligatures w14:val="none"/>
+              </w:rPr>
+              <w:t>One-to-Many</w:t>
+            </w:r>
+          </w:p>
+        </w:tc>
+        <w:tc>
+          <w:tcPr>
+            <w:tcW w:w="4860" w:type="dxa"/>
+            <w:shd w:val="clear" w:color="auto" w:fill="FFFFFF"/>
+            <w:tcMar>
+              <w:top w:w="150" w:type="dxa"/>
+              <w:left w:w="240" w:type="dxa"/>
+              <w:bottom w:w="150" w:type="dxa"/>
+              <w:right w:w="0" w:type="dxa"/>
+            </w:tcMar>
+            <w:vAlign w:val="center"/>
+            <w:hideMark/>
+          </w:tcPr>
+          <w:p>
+            <w:pPr>
+              <w:spacing w:after="0" w:line="375" w:lineRule="atLeast"/>
+              <w:rPr>
+                <w:rFonts w:ascii="Segoe UI" w:eastAsia="Times New Roman" w:hAnsi="Segoe UI" w:cs="Segoe UI"/>
+                <w:color w:val="0F1115"/>
+                <w:kern w:val="0"/>
+                <w:sz w:val="23"/>
+                <w:szCs w:val="23"/>
+                <w14:ligatures w14:val="none"/>
+              </w:rPr>
+            </w:pPr>
+            <w:r>
+              <w:rPr>
+                <w:rFonts w:ascii="Segoe UI" w:eastAsia="Times New Roman" w:hAnsi="Segoe UI" w:cs="Segoe UI"/>
+                <w:color w:val="0F1115"/>
+                <w:kern w:val="0"/>
+                <w:sz w:val="23"/>
+                <w:szCs w:val="23"/>
+                <w14:ligatures w14:val="none"/>
+              </w:rPr>
+              <w:t>One user can have many expenses</w:t>
+            </w:r>
+            <w:r>
+              <w:rPr>
+                <w:rFonts w:ascii="Segoe UI" w:eastAsia="Times New Roman" w:hAnsi="Segoe UI" w:cs="Segoe UI"/>
+                <w:color w:val="0F1115"/>
+                <w:kern w:val="0"/>
+                <w:sz w:val="23"/>
+                <w:szCs w:val="23"/>
+                <w14:ligatures w14:val="none"/>
+              </w:rPr>
+              <w:t>.</w:t>
+            </w:r>
+          </w:p>
+        </w:tc>
+      </w:tr>
+      <w:tr>
+        <w:tc>
+          <w:tcPr>
+            <w:tcW w:w="1627" w:type="dxa"/>
+            <w:shd w:val="clear" w:color="auto" w:fill="FFFFFF"/>
+            <w:tcMar>
+              <w:top w:w="150" w:type="dxa"/>
+              <w:left w:w="240" w:type="dxa"/>
+              <w:bottom w:w="150" w:type="dxa"/>
+              <w:right w:w="240" w:type="dxa"/>
+            </w:tcMar>
+            <w:vAlign w:val="center"/>
+            <w:hideMark/>
+          </w:tcPr>
+          <w:p>
+            <w:pPr>
+              <w:spacing w:after="0" w:line="375" w:lineRule="atLeast"/>
+              <w:rPr>
+                <w:rFonts w:ascii="Segoe UI" w:eastAsia="Times New Roman" w:hAnsi="Segoe UI" w:cs="Segoe UI"/>
+                <w:color w:val="0F1115"/>
+                <w:kern w:val="0"/>
+                <w:sz w:val="23"/>
+                <w:szCs w:val="23"/>
+                <w14:ligatures w14:val="none"/>
+              </w:rPr>
+            </w:pPr>
+            <w:r>
+              <w:rPr>
+                <w:rFonts w:ascii="Segoe UI" w:eastAsia="Times New Roman" w:hAnsi="Segoe UI" w:cs="Segoe UI"/>
+                <w:b/>
+                <w:bCs/>
+                <w:color w:val="0F1115"/>
+                <w:kern w:val="0"/>
+                <w:sz w:val="23"/>
+                <w:szCs w:val="23"/>
+                <w14:ligatures w14:val="none"/>
+              </w:rPr>
+              <w:t>Users</w:t>
+            </w:r>
+          </w:p>
+        </w:tc>
+        <w:tc>
+          <w:tcPr>
+            <w:tcW w:w="2778" w:type="dxa"/>
+            <w:shd w:val="clear" w:color="auto" w:fill="FFFFFF"/>
+            <w:tcMar>
+              <w:top w:w="150" w:type="dxa"/>
+              <w:left w:w="240" w:type="dxa"/>
+              <w:bottom w:w="150" w:type="dxa"/>
+              <w:right w:w="240" w:type="dxa"/>
+            </w:tcMar>
+            <w:vAlign w:val="center"/>
+            <w:hideMark/>
+          </w:tcPr>
+          <w:p>
+            <w:pPr>
+              <w:spacing w:after="0" w:line="375" w:lineRule="atLeast"/>
+              <w:rPr>
+                <w:rFonts w:ascii="Segoe UI" w:eastAsia="Times New Roman" w:hAnsi="Segoe UI" w:cs="Segoe UI"/>
+                <w:color w:val="0F1115"/>
+                <w:kern w:val="0"/>
+                <w:sz w:val="23"/>
+                <w:szCs w:val="23"/>
+                <w14:ligatures w14:val="none"/>
+              </w:rPr>
+            </w:pPr>
+            <w:r>
+              <w:rPr>
+                <w:rFonts w:ascii="Segoe UI" w:eastAsia="Times New Roman" w:hAnsi="Segoe UI" w:cs="Segoe UI"/>
+                <w:b/>
+                <w:bCs/>
+                <w:color w:val="0F1115"/>
+                <w:kern w:val="0"/>
+                <w:sz w:val="23"/>
+                <w:szCs w:val="23"/>
+                <w14:ligatures w14:val="none"/>
+              </w:rPr>
+              <w:t>Incomes</w:t>
+            </w:r>
+          </w:p>
+        </w:tc>
+        <w:tc>
+          <w:tcPr>
+            <w:tcW w:w="1980" w:type="dxa"/>
+            <w:shd w:val="clear" w:color="auto" w:fill="FFFFFF"/>
+            <w:tcMar>
+              <w:top w:w="150" w:type="dxa"/>
+              <w:left w:w="240" w:type="dxa"/>
+              <w:bottom w:w="150" w:type="dxa"/>
+              <w:right w:w="240" w:type="dxa"/>
+            </w:tcMar>
+            <w:vAlign w:val="center"/>
+            <w:hideMark/>
+          </w:tcPr>
+          <w:p>
+            <w:pPr>
+              <w:spacing w:after="0" w:line="375" w:lineRule="atLeast"/>
+              <w:rPr>
+                <w:rFonts w:ascii="Segoe UI" w:eastAsia="Times New Roman" w:hAnsi="Segoe UI" w:cs="Segoe UI"/>
+                <w:color w:val="0F1115"/>
+                <w:kern w:val="0"/>
+                <w:sz w:val="23"/>
+                <w:szCs w:val="23"/>
+                <w14:ligatures w14:val="none"/>
+              </w:rPr>
+            </w:pPr>
+            <w:r>
+              <w:rPr>
+                <w:rFonts w:ascii="Segoe UI" w:eastAsia="Times New Roman" w:hAnsi="Segoe UI" w:cs="Segoe UI"/>
+                <w:color w:val="0F1115"/>
+                <w:kern w:val="0"/>
+                <w:sz w:val="23"/>
+                <w:szCs w:val="23"/>
+                <w14:ligatures w14:val="none"/>
+              </w:rPr>
+              <w:t>One-to-Many</w:t>
+            </w:r>
+          </w:p>
+        </w:tc>
+        <w:tc>
+          <w:tcPr>
+            <w:tcW w:w="4860" w:type="dxa"/>
+            <w:shd w:val="clear" w:color="auto" w:fill="FFFFFF"/>
+            <w:tcMar>
+              <w:top w:w="150" w:type="dxa"/>
+              <w:left w:w="240" w:type="dxa"/>
+              <w:bottom w:w="150" w:type="dxa"/>
+              <w:right w:w="0" w:type="dxa"/>
+            </w:tcMar>
+            <w:vAlign w:val="center"/>
+            <w:hideMark/>
+          </w:tcPr>
+          <w:p>
+            <w:pPr>
+              <w:spacing w:after="0" w:line="375" w:lineRule="atLeast"/>
+              <w:rPr>
+                <w:rFonts w:ascii="Segoe UI" w:eastAsia="Times New Roman" w:hAnsi="Segoe UI" w:cs="Segoe UI"/>
+                <w:color w:val="0F1115"/>
+                <w:kern w:val="0"/>
+                <w:sz w:val="23"/>
+                <w:szCs w:val="23"/>
+                <w14:ligatures w14:val="none"/>
+              </w:rPr>
+            </w:pPr>
+            <w:r>
+              <w:rPr>
+                <w:rFonts w:ascii="Segoe UI" w:eastAsia="Times New Roman" w:hAnsi="Segoe UI" w:cs="Segoe UI"/>
+                <w:color w:val="0F1115"/>
+                <w:kern w:val="0"/>
+                <w:sz w:val="23"/>
+                <w:szCs w:val="23"/>
+                <w14:ligatures w14:val="none"/>
+              </w:rPr>
+              <w:t>One user can have many income</w:t>
+            </w:r>
+            <w:r>
+              <w:rPr>
+                <w:rFonts w:ascii="Segoe UI" w:eastAsia="Times New Roman" w:hAnsi="Segoe UI" w:cs="Segoe UI"/>
+                <w:color w:val="0F1115"/>
+                <w:kern w:val="0"/>
+                <w:sz w:val="23"/>
+                <w:szCs w:val="23"/>
+                <w14:ligatures w14:val="none"/>
+              </w:rPr>
+              <w:t>s.</w:t>
+            </w:r>
+          </w:p>
+        </w:tc>
+      </w:tr>
+      <w:tr>
+        <w:tc>
+          <w:tcPr>
+            <w:tcW w:w="1627" w:type="dxa"/>
+            <w:shd w:val="clear" w:color="auto" w:fill="FFFFFF"/>
+            <w:tcMar>
+              <w:top w:w="150" w:type="dxa"/>
+              <w:left w:w="240" w:type="dxa"/>
+              <w:bottom w:w="150" w:type="dxa"/>
+              <w:right w:w="240" w:type="dxa"/>
+            </w:tcMar>
+            <w:vAlign w:val="center"/>
+            <w:hideMark/>
+          </w:tcPr>
+          <w:p>
+            <w:pPr>
+              <w:spacing w:after="0" w:line="375" w:lineRule="atLeast"/>
+              <w:rPr>
+                <w:rFonts w:ascii="Segoe UI" w:eastAsia="Times New Roman" w:hAnsi="Segoe UI" w:cs="Segoe UI"/>
+                <w:color w:val="0F1115"/>
+                <w:kern w:val="0"/>
+                <w:sz w:val="23"/>
+                <w:szCs w:val="23"/>
+                <w14:ligatures w14:val="none"/>
+              </w:rPr>
+            </w:pPr>
+            <w:r>
+              <w:rPr>
+                <w:rFonts w:ascii="Segoe UI" w:eastAsia="Times New Roman" w:hAnsi="Segoe UI" w:cs="Segoe UI"/>
+                <w:b/>
+                <w:bCs/>
+                <w:color w:val="0F1115"/>
+                <w:kern w:val="0"/>
+                <w:sz w:val="23"/>
+                <w:szCs w:val="23"/>
+                <w14:ligatures w14:val="none"/>
+              </w:rPr>
+              <w:t>Users</w:t>
+            </w:r>
+          </w:p>
+        </w:tc>
+        <w:tc>
+          <w:tcPr>
+            <w:tcW w:w="2778" w:type="dxa"/>
+            <w:shd w:val="clear" w:color="auto" w:fill="FFFFFF"/>
+            <w:tcMar>
+              <w:top w:w="150" w:type="dxa"/>
+              <w:left w:w="240" w:type="dxa"/>
+              <w:bottom w:w="150" w:type="dxa"/>
+              <w:right w:w="240" w:type="dxa"/>
+            </w:tcMar>
+            <w:vAlign w:val="center"/>
+            <w:hideMark/>
+          </w:tcPr>
+          <w:p>
+            <w:pPr>
+              <w:spacing w:after="0" w:line="375" w:lineRule="atLeast"/>
+              <w:rPr>
+                <w:rFonts w:ascii="Segoe UI" w:eastAsia="Times New Roman" w:hAnsi="Segoe UI" w:cs="Segoe UI"/>
+                <w:color w:val="0F1115"/>
+                <w:kern w:val="0"/>
+                <w:sz w:val="23"/>
+                <w:szCs w:val="23"/>
+                <w14:ligatures w14:val="none"/>
+              </w:rPr>
+            </w:pPr>
+            <w:r>
+              <w:rPr>
+                <w:rFonts w:ascii="Segoe UI" w:eastAsia="Times New Roman" w:hAnsi="Segoe UI" w:cs="Segoe UI"/>
+                <w:b/>
+                <w:bCs/>
+                <w:color w:val="0F1115"/>
+                <w:kern w:val="0"/>
+                <w:sz w:val="23"/>
+                <w:szCs w:val="23"/>
+                <w14:ligatures w14:val="none"/>
+              </w:rPr>
+              <w:t>Monthly_Budgets</w:t>
+            </w:r>
+          </w:p>
+        </w:tc>
+        <w:tc>
+          <w:tcPr>
+            <w:tcW w:w="1980" w:type="dxa"/>
+            <w:shd w:val="clear" w:color="auto" w:fill="FFFFFF"/>
+            <w:tcMar>
+              <w:top w:w="150" w:type="dxa"/>
+              <w:left w:w="240" w:type="dxa"/>
+              <w:bottom w:w="150" w:type="dxa"/>
+              <w:right w:w="240" w:type="dxa"/>
+            </w:tcMar>
+            <w:vAlign w:val="center"/>
+            <w:hideMark/>
+          </w:tcPr>
+          <w:p>
+            <w:pPr>
+              <w:spacing w:after="0" w:line="375" w:lineRule="atLeast"/>
+              <w:rPr>
+                <w:rFonts w:ascii="Segoe UI" w:eastAsia="Times New Roman" w:hAnsi="Segoe UI" w:cs="Segoe UI"/>
+                <w:color w:val="0F1115"/>
+                <w:kern w:val="0"/>
+                <w:sz w:val="23"/>
+                <w:szCs w:val="23"/>
+                <w14:ligatures w14:val="none"/>
+              </w:rPr>
+            </w:pPr>
+            <w:r>
+              <w:rPr>
+                <w:rFonts w:ascii="Segoe UI" w:eastAsia="Times New Roman" w:hAnsi="Segoe UI" w:cs="Segoe UI"/>
+                <w:color w:val="0F1115"/>
+                <w:kern w:val="0"/>
+                <w:sz w:val="23"/>
+                <w:szCs w:val="23"/>
+                <w14:ligatures w14:val="none"/>
+              </w:rPr>
+              <w:t>One-to-Many</w:t>
+            </w:r>
+          </w:p>
+        </w:tc>
+        <w:tc>
+          <w:tcPr>
+            <w:tcW w:w="4860" w:type="dxa"/>
+            <w:shd w:val="clear" w:color="auto" w:fill="FFFFFF"/>
+            <w:tcMar>
+              <w:top w:w="150" w:type="dxa"/>
+              <w:left w:w="240" w:type="dxa"/>
+              <w:bottom w:w="150" w:type="dxa"/>
+              <w:right w:w="0" w:type="dxa"/>
+            </w:tcMar>
+            <w:vAlign w:val="center"/>
+            <w:hideMark/>
+          </w:tcPr>
+          <w:p>
+            <w:pPr>
+              <w:spacing w:after="0" w:line="375" w:lineRule="atLeast"/>
+              <w:rPr>
+                <w:rFonts w:ascii="Segoe UI" w:eastAsia="Times New Roman" w:hAnsi="Segoe UI" w:cs="Segoe UI"/>
+                <w:color w:val="0F1115"/>
+                <w:kern w:val="0"/>
+                <w:sz w:val="23"/>
+                <w:szCs w:val="23"/>
+                <w14:ligatures w14:val="none"/>
+              </w:rPr>
+            </w:pPr>
+            <w:r>
+              <w:rPr>
+                <w:rFonts w:ascii="Segoe UI" w:eastAsia="Times New Roman" w:hAnsi="Segoe UI" w:cs="Segoe UI"/>
+                <w:color w:val="0F1115"/>
+                <w:kern w:val="0"/>
+                <w:sz w:val="23"/>
+                <w:szCs w:val="23"/>
+                <w14:ligatures w14:val="none"/>
+              </w:rPr>
+              <w:t xml:space="preserve">One user can </w:t>
+            </w:r>
+            <w:r>
+              <w:rPr>
+                <w:rFonts w:ascii="Segoe UI" w:eastAsia="Times New Roman" w:hAnsi="Segoe UI" w:cs="Segoe UI"/>
+                <w:color w:val="0F1115"/>
+                <w:kern w:val="0"/>
+                <w:sz w:val="23"/>
+                <w:szCs w:val="23"/>
+                <w14:ligatures w14:val="none"/>
+              </w:rPr>
+              <w:t>have</w:t>
+            </w:r>
+            <w:r>
+              <w:rPr>
+                <w:rFonts w:ascii="Segoe UI" w:eastAsia="Times New Roman" w:hAnsi="Segoe UI" w:cs="Segoe UI"/>
+                <w:color w:val="0F1115"/>
+                <w:kern w:val="0"/>
+                <w:sz w:val="23"/>
+                <w:szCs w:val="23"/>
+                <w14:ligatures w14:val="none"/>
+              </w:rPr>
+              <w:t xml:space="preserve"> many monthly budgets</w:t>
+            </w:r>
+            <w:r>
+              <w:rPr>
+                <w:rFonts w:ascii="Segoe UI" w:eastAsia="Times New Roman" w:hAnsi="Segoe UI" w:cs="Segoe UI"/>
+                <w:color w:val="0F1115"/>
+                <w:kern w:val="0"/>
+                <w:sz w:val="23"/>
+                <w:szCs w:val="23"/>
+                <w14:ligatures w14:val="none"/>
+              </w:rPr>
+              <w:t>.</w:t>
+            </w:r>
+          </w:p>
+        </w:tc>
+      </w:tr>
+      <w:tr>
+        <w:tc>
+          <w:tcPr>
+            <w:tcW w:w="1627" w:type="dxa"/>
+            <w:shd w:val="clear" w:color="auto" w:fill="FFFFFF"/>
+            <w:tcMar>
+              <w:top w:w="150" w:type="dxa"/>
+              <w:left w:w="240" w:type="dxa"/>
+              <w:bottom w:w="150" w:type="dxa"/>
+              <w:right w:w="240" w:type="dxa"/>
+            </w:tcMar>
+            <w:vAlign w:val="center"/>
+            <w:hideMark/>
+          </w:tcPr>
+          <w:p>
+            <w:pPr>
+              <w:spacing w:after="0" w:line="375" w:lineRule="atLeast"/>
+              <w:rPr>
+                <w:rFonts w:ascii="Segoe UI" w:eastAsia="Times New Roman" w:hAnsi="Segoe UI" w:cs="Segoe UI"/>
+                <w:color w:val="0F1115"/>
+                <w:kern w:val="0"/>
+                <w:sz w:val="23"/>
+                <w:szCs w:val="23"/>
+                <w14:ligatures w14:val="none"/>
+              </w:rPr>
+            </w:pPr>
+            <w:r>
+              <w:rPr>
+                <w:rFonts w:ascii="Segoe UI" w:eastAsia="Times New Roman" w:hAnsi="Segoe UI" w:cs="Segoe UI"/>
+                <w:b/>
+                <w:bCs/>
+                <w:color w:val="0F1115"/>
+                <w:kern w:val="0"/>
+                <w:sz w:val="23"/>
+                <w:szCs w:val="23"/>
+                <w14:ligatures w14:val="none"/>
+              </w:rPr>
+              <w:t>Users</w:t>
+            </w:r>
+          </w:p>
+        </w:tc>
+        <w:tc>
+          <w:tcPr>
+            <w:tcW w:w="2778" w:type="dxa"/>
+            <w:shd w:val="clear" w:color="auto" w:fill="FFFFFF"/>
+            <w:tcMar>
+              <w:top w:w="150" w:type="dxa"/>
+              <w:left w:w="240" w:type="dxa"/>
+              <w:bottom w:w="150" w:type="dxa"/>
+              <w:right w:w="240" w:type="dxa"/>
+            </w:tcMar>
+            <w:vAlign w:val="center"/>
+            <w:hideMark/>
+          </w:tcPr>
+          <w:p>
+            <w:pPr>
+              <w:spacing w:after="0" w:line="375" w:lineRule="atLeast"/>
+              <w:rPr>
+                <w:rFonts w:ascii="Segoe UI" w:eastAsia="Times New Roman" w:hAnsi="Segoe UI" w:cs="Segoe UI"/>
+                <w:color w:val="0F1115"/>
+                <w:kern w:val="0"/>
+                <w:sz w:val="23"/>
+                <w:szCs w:val="23"/>
+                <w14:ligatures w14:val="none"/>
+              </w:rPr>
+            </w:pPr>
+            <w:r>
+              <w:rPr>
+                <w:rFonts w:ascii="Segoe UI" w:eastAsia="Times New Roman" w:hAnsi="Segoe UI" w:cs="Segoe UI"/>
+                <w:b/>
+                <w:bCs/>
+                <w:color w:val="0F1115"/>
+                <w:kern w:val="0"/>
+                <w:sz w:val="23"/>
+                <w:szCs w:val="23"/>
+                <w14:ligatures w14:val="none"/>
+              </w:rPr>
+              <w:t>Budgets_Suggestions</w:t>
+            </w:r>
+          </w:p>
+        </w:tc>
+        <w:tc>
+          <w:tcPr>
+            <w:tcW w:w="1980" w:type="dxa"/>
+            <w:shd w:val="clear" w:color="auto" w:fill="FFFFFF"/>
+            <w:tcMar>
+              <w:top w:w="150" w:type="dxa"/>
+              <w:left w:w="240" w:type="dxa"/>
+              <w:bottom w:w="150" w:type="dxa"/>
+              <w:right w:w="240" w:type="dxa"/>
+            </w:tcMar>
+            <w:vAlign w:val="center"/>
+            <w:hideMark/>
+          </w:tcPr>
+          <w:p>
+            <w:pPr>
+              <w:spacing w:after="0" w:line="375" w:lineRule="atLeast"/>
+              <w:rPr>
+                <w:rFonts w:ascii="Segoe UI" w:eastAsia="Times New Roman" w:hAnsi="Segoe UI" w:cs="Segoe UI"/>
+                <w:color w:val="0F1115"/>
+                <w:kern w:val="0"/>
+                <w:sz w:val="23"/>
+                <w:szCs w:val="23"/>
+                <w14:ligatures w14:val="none"/>
+              </w:rPr>
+            </w:pPr>
+            <w:r>
+              <w:rPr>
+                <w:rFonts w:ascii="Segoe UI" w:eastAsia="Times New Roman" w:hAnsi="Segoe UI" w:cs="Segoe UI"/>
+                <w:color w:val="0F1115"/>
+                <w:kern w:val="0"/>
+                <w:sz w:val="23"/>
+                <w:szCs w:val="23"/>
+                <w14:ligatures w14:val="none"/>
+              </w:rPr>
+              <w:t>One-to-Many</w:t>
+            </w:r>
+          </w:p>
+        </w:tc>
+        <w:tc>
+          <w:tcPr>
+            <w:tcW w:w="4860" w:type="dxa"/>
+            <w:shd w:val="clear" w:color="auto" w:fill="FFFFFF"/>
+            <w:tcMar>
+              <w:top w:w="150" w:type="dxa"/>
+              <w:left w:w="240" w:type="dxa"/>
+              <w:bottom w:w="150" w:type="dxa"/>
+              <w:right w:w="0" w:type="dxa"/>
+            </w:tcMar>
+            <w:vAlign w:val="center"/>
+            <w:hideMark/>
+          </w:tcPr>
+          <w:p>
+            <w:pPr>
+              <w:spacing w:after="0" w:line="375" w:lineRule="atLeast"/>
+              <w:rPr>
+                <w:rFonts w:ascii="Segoe UI" w:eastAsia="Times New Roman" w:hAnsi="Segoe UI" w:cs="Segoe UI"/>
+                <w:color w:val="0F1115"/>
+                <w:kern w:val="0"/>
+                <w:sz w:val="23"/>
+                <w:szCs w:val="23"/>
+                <w14:ligatures w14:val="none"/>
+              </w:rPr>
+            </w:pPr>
+            <w:r>
+              <w:rPr>
+                <w:rFonts w:ascii="Segoe UI" w:eastAsia="Times New Roman" w:hAnsi="Segoe UI" w:cs="Segoe UI"/>
+                <w:color w:val="0F1115"/>
+                <w:kern w:val="0"/>
+                <w:sz w:val="23"/>
+                <w:szCs w:val="23"/>
+                <w14:ligatures w14:val="none"/>
+              </w:rPr>
+              <w:t>One user can receive many suggestions</w:t>
+            </w:r>
+            <w:r>
+              <w:rPr>
+                <w:rFonts w:ascii="Segoe UI" w:eastAsia="Times New Roman" w:hAnsi="Segoe UI" w:cs="Segoe UI"/>
+                <w:color w:val="0F1115"/>
+                <w:kern w:val="0"/>
+                <w:sz w:val="23"/>
+                <w:szCs w:val="23"/>
+                <w14:ligatures w14:val="none"/>
+              </w:rPr>
+              <w:t>.</w:t>
+            </w:r>
+          </w:p>
+        </w:tc>
+      </w:tr>
+      <w:tr>
+        <w:tc>
+          <w:tcPr>
+            <w:tcW w:w="1627" w:type="dxa"/>
+            <w:shd w:val="clear" w:color="auto" w:fill="FFFFFF"/>
+            <w:tcMar>
+              <w:top w:w="150" w:type="dxa"/>
+              <w:left w:w="240" w:type="dxa"/>
+              <w:bottom w:w="150" w:type="dxa"/>
+              <w:right w:w="240" w:type="dxa"/>
+            </w:tcMar>
+            <w:vAlign w:val="center"/>
+            <w:hideMark/>
+          </w:tcPr>
+          <w:p>
+            <w:pPr>
+              <w:spacing w:after="0" w:line="375" w:lineRule="atLeast"/>
+              <w:rPr>
+                <w:rFonts w:ascii="Segoe UI" w:eastAsia="Times New Roman" w:hAnsi="Segoe UI" w:cs="Segoe UI"/>
+                <w:color w:val="0F1115"/>
+                <w:kern w:val="0"/>
+                <w:sz w:val="23"/>
+                <w:szCs w:val="23"/>
+                <w14:ligatures w14:val="none"/>
+              </w:rPr>
+            </w:pPr>
+            <w:r>
+              <w:rPr>
+                <w:rFonts w:ascii="Segoe UI" w:eastAsia="Times New Roman" w:hAnsi="Segoe UI" w:cs="Segoe UI"/>
+                <w:b/>
+                <w:bCs/>
+                <w:color w:val="0F1115"/>
+                <w:kern w:val="0"/>
+                <w:sz w:val="23"/>
+                <w:szCs w:val="23"/>
+                <w14:ligatures w14:val="none"/>
+              </w:rPr>
+              <w:t>Users</w:t>
+            </w:r>
+          </w:p>
+        </w:tc>
+        <w:tc>
+          <w:tcPr>
+            <w:tcW w:w="2778" w:type="dxa"/>
+            <w:shd w:val="clear" w:color="auto" w:fill="FFFFFF"/>
+            <w:tcMar>
+              <w:top w:w="150" w:type="dxa"/>
+              <w:left w:w="240" w:type="dxa"/>
+              <w:bottom w:w="150" w:type="dxa"/>
+              <w:right w:w="240" w:type="dxa"/>
+            </w:tcMar>
+            <w:vAlign w:val="center"/>
+            <w:hideMark/>
+          </w:tcPr>
+          <w:p>
+            <w:pPr>
+              <w:spacing w:after="0" w:line="375" w:lineRule="atLeast"/>
+              <w:rPr>
+                <w:rFonts w:ascii="Segoe UI" w:eastAsia="Times New Roman" w:hAnsi="Segoe UI" w:cs="Segoe UI"/>
+                <w:color w:val="0F1115"/>
+                <w:kern w:val="0"/>
+                <w:sz w:val="23"/>
+                <w:szCs w:val="23"/>
+                <w14:ligatures w14:val="none"/>
+              </w:rPr>
+            </w:pPr>
+            <w:r>
+              <w:rPr>
+                <w:rFonts w:ascii="Segoe UI" w:eastAsia="Times New Roman" w:hAnsi="Segoe UI" w:cs="Segoe UI"/>
+                <w:b/>
+                <w:bCs/>
+                <w:color w:val="0F1115"/>
+                <w:kern w:val="0"/>
+                <w:sz w:val="23"/>
+                <w:szCs w:val="23"/>
+                <w14:ligatures w14:val="none"/>
+              </w:rPr>
+              <w:t>Users_Feedbacks</w:t>
+            </w:r>
+          </w:p>
+        </w:tc>
+        <w:tc>
+          <w:tcPr>
+            <w:tcW w:w="1980" w:type="dxa"/>
+            <w:shd w:val="clear" w:color="auto" w:fill="FFFFFF"/>
+            <w:tcMar>
+              <w:top w:w="150" w:type="dxa"/>
+              <w:left w:w="240" w:type="dxa"/>
+              <w:bottom w:w="150" w:type="dxa"/>
+              <w:right w:w="240" w:type="dxa"/>
+            </w:tcMar>
+            <w:vAlign w:val="center"/>
+            <w:hideMark/>
+          </w:tcPr>
+          <w:p>
+            <w:pPr>
+              <w:spacing w:after="0" w:line="375" w:lineRule="atLeast"/>
+              <w:rPr>
+                <w:rFonts w:ascii="Segoe UI" w:eastAsia="Times New Roman" w:hAnsi="Segoe UI" w:cs="Segoe UI"/>
+                <w:color w:val="0F1115"/>
+                <w:kern w:val="0"/>
+                <w:sz w:val="23"/>
+                <w:szCs w:val="23"/>
+                <w14:ligatures w14:val="none"/>
+              </w:rPr>
+            </w:pPr>
+            <w:r>
+              <w:rPr>
+                <w:rFonts w:ascii="Segoe UI" w:eastAsia="Times New Roman" w:hAnsi="Segoe UI" w:cs="Segoe UI"/>
+                <w:color w:val="0F1115"/>
+                <w:kern w:val="0"/>
+                <w:sz w:val="23"/>
+                <w:szCs w:val="23"/>
+                <w14:ligatures w14:val="none"/>
+              </w:rPr>
+              <w:t>One-to-Many</w:t>
+            </w:r>
+          </w:p>
+        </w:tc>
+        <w:tc>
+          <w:tcPr>
+            <w:tcW w:w="4860" w:type="dxa"/>
+            <w:shd w:val="clear" w:color="auto" w:fill="FFFFFF"/>
+            <w:tcMar>
+              <w:top w:w="150" w:type="dxa"/>
+              <w:left w:w="240" w:type="dxa"/>
+              <w:bottom w:w="150" w:type="dxa"/>
+              <w:right w:w="0" w:type="dxa"/>
+            </w:tcMar>
+            <w:vAlign w:val="center"/>
+            <w:hideMark/>
+          </w:tcPr>
+          <w:p>
+            <w:pPr>
+              <w:spacing w:after="0" w:line="375" w:lineRule="atLeast"/>
+              <w:rPr>
+                <w:rFonts w:ascii="Segoe UI" w:eastAsia="Times New Roman" w:hAnsi="Segoe UI" w:cs="Segoe UI"/>
+                <w:color w:val="0F1115"/>
+                <w:kern w:val="0"/>
+                <w:sz w:val="23"/>
+                <w:szCs w:val="23"/>
+                <w14:ligatures w14:val="none"/>
+              </w:rPr>
+            </w:pPr>
+            <w:r>
+              <w:rPr>
+                <w:rFonts w:ascii="Segoe UI" w:eastAsia="Times New Roman" w:hAnsi="Segoe UI" w:cs="Segoe UI"/>
+                <w:color w:val="0F1115"/>
+                <w:kern w:val="0"/>
+                <w:sz w:val="23"/>
+                <w:szCs w:val="23"/>
+                <w14:ligatures w14:val="none"/>
+              </w:rPr>
+              <w:t>One user can submit many feedback entries</w:t>
+            </w:r>
+            <w:r>
+              <w:rPr>
+                <w:rFonts w:ascii="Segoe UI" w:eastAsia="Times New Roman" w:hAnsi="Segoe UI" w:cs="Segoe UI"/>
+                <w:color w:val="0F1115"/>
+                <w:kern w:val="0"/>
+                <w:sz w:val="23"/>
+                <w:szCs w:val="23"/>
+                <w14:ligatures w14:val="none"/>
+              </w:rPr>
+              <w:t>.</w:t>
+            </w:r>
+          </w:p>
+        </w:tc>
+      </w:tr>
+      <w:tr>
+        <w:tc>
+          <w:tcPr>
+            <w:tcW w:w="1627" w:type="dxa"/>
+            <w:shd w:val="clear" w:color="auto" w:fill="FFFFFF"/>
+            <w:tcMar>
+              <w:top w:w="150" w:type="dxa"/>
+              <w:left w:w="240" w:type="dxa"/>
+              <w:bottom w:w="150" w:type="dxa"/>
+              <w:right w:w="240" w:type="dxa"/>
+            </w:tcMar>
+            <w:vAlign w:val="center"/>
+            <w:hideMark/>
+          </w:tcPr>
+          <w:p>
+            <w:pPr>
+              <w:spacing w:after="0" w:line="375" w:lineRule="atLeast"/>
+              <w:rPr>
+                <w:rFonts w:ascii="Segoe UI" w:eastAsia="Times New Roman" w:hAnsi="Segoe UI" w:cs="Segoe UI"/>
+                <w:color w:val="0F1115"/>
+                <w:kern w:val="0"/>
+                <w:sz w:val="23"/>
+                <w:szCs w:val="23"/>
+                <w14:ligatures w14:val="none"/>
+              </w:rPr>
+            </w:pPr>
+            <w:r>
+              <w:rPr>
+                <w:rFonts w:ascii="Segoe UI" w:eastAsia="Times New Roman" w:hAnsi="Segoe UI" w:cs="Segoe UI"/>
+                <w:b/>
+                <w:bCs/>
+                <w:color w:val="0F1115"/>
+                <w:kern w:val="0"/>
+                <w:sz w:val="23"/>
+                <w:szCs w:val="23"/>
+                <w14:ligatures w14:val="none"/>
+              </w:rPr>
+              <w:t>Users</w:t>
+            </w:r>
+          </w:p>
+        </w:tc>
+        <w:tc>
+          <w:tcPr>
+            <w:tcW w:w="2778" w:type="dxa"/>
+            <w:shd w:val="clear" w:color="auto" w:fill="FFFFFF"/>
+            <w:tcMar>
+              <w:top w:w="150" w:type="dxa"/>
+              <w:left w:w="240" w:type="dxa"/>
+              <w:bottom w:w="150" w:type="dxa"/>
+              <w:right w:w="240" w:type="dxa"/>
+            </w:tcMar>
+            <w:vAlign w:val="center"/>
+            <w:hideMark/>
+          </w:tcPr>
+          <w:p>
+            <w:pPr>
+              <w:spacing w:after="0" w:line="375" w:lineRule="atLeast"/>
+              <w:rPr>
+                <w:rFonts w:ascii="Segoe UI" w:eastAsia="Times New Roman" w:hAnsi="Segoe UI" w:cs="Segoe UI"/>
+                <w:color w:val="0F1115"/>
+                <w:kern w:val="0"/>
+                <w:sz w:val="23"/>
+                <w:szCs w:val="23"/>
+                <w14:ligatures w14:val="none"/>
+              </w:rPr>
+            </w:pPr>
+            <w:r>
+              <w:rPr>
+                <w:rFonts w:ascii="Segoe UI" w:eastAsia="Times New Roman" w:hAnsi="Segoe UI" w:cs="Segoe UI"/>
+                <w:b/>
+                <w:bCs/>
+                <w:color w:val="0F1115"/>
+                <w:kern w:val="0"/>
+                <w:sz w:val="23"/>
+                <w:szCs w:val="23"/>
+                <w14:ligatures w14:val="none"/>
+              </w:rPr>
+              <w:t>Receipts</w:t>
+            </w:r>
+          </w:p>
+        </w:tc>
+        <w:tc>
+          <w:tcPr>
+            <w:tcW w:w="1980" w:type="dxa"/>
+            <w:shd w:val="clear" w:color="auto" w:fill="FFFFFF"/>
+            <w:tcMar>
+              <w:top w:w="150" w:type="dxa"/>
+              <w:left w:w="240" w:type="dxa"/>
+              <w:bottom w:w="150" w:type="dxa"/>
+              <w:right w:w="240" w:type="dxa"/>
+            </w:tcMar>
+            <w:vAlign w:val="center"/>
+            <w:hideMark/>
+          </w:tcPr>
+          <w:p>
+            <w:pPr>
+              <w:spacing w:after="0" w:line="375" w:lineRule="atLeast"/>
+              <w:rPr>
+                <w:rFonts w:ascii="Segoe UI" w:eastAsia="Times New Roman" w:hAnsi="Segoe UI" w:cs="Segoe UI"/>
+                <w:color w:val="0F1115"/>
+                <w:kern w:val="0"/>
+                <w:sz w:val="23"/>
+                <w:szCs w:val="23"/>
+                <w14:ligatures w14:val="none"/>
+              </w:rPr>
+            </w:pPr>
+            <w:r>
+              <w:rPr>
+                <w:rFonts w:ascii="Segoe UI" w:eastAsia="Times New Roman" w:hAnsi="Segoe UI" w:cs="Segoe UI"/>
+                <w:color w:val="0F1115"/>
+                <w:kern w:val="0"/>
+                <w:sz w:val="23"/>
+                <w:szCs w:val="23"/>
+                <w14:ligatures w14:val="none"/>
+              </w:rPr>
+              <w:t>One-to-Many</w:t>
+            </w:r>
+          </w:p>
+        </w:tc>
+        <w:tc>
+          <w:tcPr>
+            <w:tcW w:w="4860" w:type="dxa"/>
+            <w:shd w:val="clear" w:color="auto" w:fill="FFFFFF"/>
+            <w:tcMar>
+              <w:top w:w="150" w:type="dxa"/>
+              <w:left w:w="240" w:type="dxa"/>
+              <w:bottom w:w="150" w:type="dxa"/>
+              <w:right w:w="0" w:type="dxa"/>
+            </w:tcMar>
+            <w:vAlign w:val="center"/>
+            <w:hideMark/>
+          </w:tcPr>
+          <w:p>
+            <w:pPr>
+              <w:spacing w:after="0" w:line="375" w:lineRule="atLeast"/>
+              <w:rPr>
+                <w:rFonts w:ascii="Segoe UI" w:eastAsia="Times New Roman" w:hAnsi="Segoe UI" w:cs="Segoe UI"/>
+                <w:color w:val="0F1115"/>
+                <w:kern w:val="0"/>
+                <w:sz w:val="23"/>
+                <w:szCs w:val="23"/>
+                <w14:ligatures w14:val="none"/>
+              </w:rPr>
+            </w:pPr>
+            <w:r>
+              <w:rPr>
+                <w:rFonts w:ascii="Segoe UI" w:eastAsia="Times New Roman" w:hAnsi="Segoe UI" w:cs="Segoe UI"/>
+                <w:color w:val="0F1115"/>
+                <w:kern w:val="0"/>
+                <w:sz w:val="23"/>
+                <w:szCs w:val="23"/>
+                <w14:ligatures w14:val="none"/>
+              </w:rPr>
+              <w:t>One user can upload many receipts</w:t>
+            </w:r>
+            <w:r>
+              <w:rPr>
+                <w:rFonts w:ascii="Segoe UI" w:eastAsia="Times New Roman" w:hAnsi="Segoe UI" w:cs="Segoe UI"/>
+                <w:color w:val="0F1115"/>
+                <w:kern w:val="0"/>
+                <w:sz w:val="23"/>
+                <w:szCs w:val="23"/>
+                <w14:ligatures w14:val="none"/>
+              </w:rPr>
+              <w:t>.</w:t>
+            </w:r>
+          </w:p>
+        </w:tc>
+      </w:tr>
+      <w:tr>
+        <w:tc>
+          <w:tcPr>
+            <w:tcW w:w="1627" w:type="dxa"/>
+            <w:shd w:val="clear" w:color="auto" w:fill="FFFFFF"/>
+            <w:tcMar>
+              <w:top w:w="150" w:type="dxa"/>
+              <w:left w:w="240" w:type="dxa"/>
+              <w:bottom w:w="150" w:type="dxa"/>
+              <w:right w:w="240" w:type="dxa"/>
+            </w:tcMar>
+            <w:vAlign w:val="center"/>
+            <w:hideMark/>
+          </w:tcPr>
+          <w:p>
+            <w:pPr>
+              <w:spacing w:after="0" w:line="375" w:lineRule="atLeast"/>
+              <w:rPr>
+                <w:rFonts w:ascii="Segoe UI" w:eastAsia="Times New Roman" w:hAnsi="Segoe UI" w:cs="Segoe UI"/>
+                <w:color w:val="0F1115"/>
+                <w:kern w:val="0"/>
+                <w:sz w:val="23"/>
+                <w:szCs w:val="23"/>
+                <w14:ligatures w14:val="none"/>
+              </w:rPr>
+            </w:pPr>
+            <w:r>
+              <w:rPr>
+                <w:rFonts w:ascii="Segoe UI" w:eastAsia="Times New Roman" w:hAnsi="Segoe UI" w:cs="Segoe UI"/>
+                <w:b/>
+                <w:bCs/>
+                <w:color w:val="0F1115"/>
+                <w:kern w:val="0"/>
+                <w:sz w:val="23"/>
+                <w:szCs w:val="23"/>
+                <w14:ligatures w14:val="none"/>
+              </w:rPr>
+              <w:t>Categories</w:t>
+            </w:r>
+          </w:p>
+        </w:tc>
+        <w:tc>
+          <w:tcPr>
+            <w:tcW w:w="2778" w:type="dxa"/>
+            <w:shd w:val="clear" w:color="auto" w:fill="FFFFFF"/>
+            <w:tcMar>
+              <w:top w:w="150" w:type="dxa"/>
+              <w:left w:w="240" w:type="dxa"/>
+              <w:bottom w:w="150" w:type="dxa"/>
+              <w:right w:w="240" w:type="dxa"/>
+            </w:tcMar>
+            <w:vAlign w:val="center"/>
+            <w:hideMark/>
+          </w:tcPr>
+          <w:p>
+            <w:pPr>
+              <w:spacing w:after="0" w:line="375" w:lineRule="atLeast"/>
+              <w:rPr>
+                <w:rFonts w:ascii="Segoe UI" w:eastAsia="Times New Roman" w:hAnsi="Segoe UI" w:cs="Segoe UI"/>
+                <w:color w:val="0F1115"/>
+                <w:kern w:val="0"/>
+                <w:sz w:val="23"/>
+                <w:szCs w:val="23"/>
+                <w14:ligatures w14:val="none"/>
+              </w:rPr>
+            </w:pPr>
+            <w:r>
+              <w:rPr>
+                <w:rFonts w:ascii="Segoe UI" w:eastAsia="Times New Roman" w:hAnsi="Segoe UI" w:cs="Segoe UI"/>
+                <w:b/>
+                <w:bCs/>
+                <w:color w:val="0F1115"/>
+                <w:kern w:val="0"/>
+                <w:sz w:val="23"/>
+                <w:szCs w:val="23"/>
+                <w14:ligatures w14:val="none"/>
+              </w:rPr>
+              <w:t>Expenses</w:t>
+            </w:r>
+          </w:p>
+        </w:tc>
+        <w:tc>
+          <w:tcPr>
+            <w:tcW w:w="1980" w:type="dxa"/>
+            <w:shd w:val="clear" w:color="auto" w:fill="FFFFFF"/>
+            <w:tcMar>
+              <w:top w:w="150" w:type="dxa"/>
+              <w:left w:w="240" w:type="dxa"/>
+              <w:bottom w:w="150" w:type="dxa"/>
+              <w:right w:w="240" w:type="dxa"/>
+            </w:tcMar>
+            <w:vAlign w:val="center"/>
+            <w:hideMark/>
+          </w:tcPr>
+          <w:p>
+            <w:pPr>
+              <w:spacing w:after="0" w:line="375" w:lineRule="atLeast"/>
+              <w:rPr>
+                <w:rFonts w:ascii="Segoe UI" w:eastAsia="Times New Roman" w:hAnsi="Segoe UI" w:cs="Segoe UI"/>
+                <w:color w:val="0F1115"/>
+                <w:kern w:val="0"/>
+                <w:sz w:val="23"/>
+                <w:szCs w:val="23"/>
+                <w14:ligatures w14:val="none"/>
+              </w:rPr>
+            </w:pPr>
+            <w:r>
+              <w:rPr>
+                <w:rFonts w:ascii="Segoe UI" w:eastAsia="Times New Roman" w:hAnsi="Segoe UI" w:cs="Segoe UI"/>
+                <w:color w:val="0F1115"/>
+                <w:kern w:val="0"/>
+                <w:sz w:val="23"/>
+                <w:szCs w:val="23"/>
+                <w14:ligatures w14:val="none"/>
+              </w:rPr>
+              <w:t>One-to-Many</w:t>
+            </w:r>
+          </w:p>
+        </w:tc>
+        <w:tc>
+          <w:tcPr>
+            <w:tcW w:w="4860" w:type="dxa"/>
+            <w:shd w:val="clear" w:color="auto" w:fill="FFFFFF"/>
+            <w:tcMar>
+              <w:top w:w="150" w:type="dxa"/>
+              <w:left w:w="240" w:type="dxa"/>
+              <w:bottom w:w="150" w:type="dxa"/>
+              <w:right w:w="0" w:type="dxa"/>
+            </w:tcMar>
+            <w:vAlign w:val="center"/>
+            <w:hideMark/>
+          </w:tcPr>
+          <w:p>
+            <w:pPr>
+              <w:spacing w:after="0" w:line="375" w:lineRule="atLeast"/>
+              <w:rPr>
+                <w:rFonts w:ascii="Segoe UI" w:eastAsia="Times New Roman" w:hAnsi="Segoe UI" w:cs="Segoe UI"/>
+                <w:color w:val="0F1115"/>
+                <w:kern w:val="0"/>
+                <w:sz w:val="23"/>
+                <w:szCs w:val="23"/>
+                <w14:ligatures w14:val="none"/>
+              </w:rPr>
+            </w:pPr>
+            <w:r>
+              <w:rPr>
+                <w:rFonts w:ascii="Segoe UI" w:eastAsia="Times New Roman" w:hAnsi="Segoe UI" w:cs="Segoe UI"/>
+                <w:color w:val="0F1115"/>
+                <w:kern w:val="0"/>
+                <w:sz w:val="23"/>
+                <w:szCs w:val="23"/>
+                <w14:ligatures w14:val="none"/>
+              </w:rPr>
+              <w:t>One category can belong to many expenses</w:t>
+            </w:r>
+            <w:r>
+              <w:rPr>
+                <w:rFonts w:ascii="Segoe UI" w:eastAsia="Times New Roman" w:hAnsi="Segoe UI" w:cs="Segoe UI"/>
+                <w:color w:val="0F1115"/>
+                <w:kern w:val="0"/>
+                <w:sz w:val="23"/>
+                <w:szCs w:val="23"/>
+                <w14:ligatures w14:val="none"/>
+              </w:rPr>
+              <w:t>.</w:t>
+            </w:r>
+          </w:p>
+        </w:tc>
+      </w:tr>
+      <w:tr>
+        <w:tc>
+          <w:tcPr>
+            <w:tcW w:w="1627" w:type="dxa"/>
+            <w:shd w:val="clear" w:color="auto" w:fill="FFFFFF"/>
+            <w:tcMar>
+              <w:top w:w="150" w:type="dxa"/>
+              <w:left w:w="240" w:type="dxa"/>
+              <w:bottom w:w="150" w:type="dxa"/>
+              <w:right w:w="240" w:type="dxa"/>
+            </w:tcMar>
+            <w:vAlign w:val="center"/>
+            <w:hideMark/>
+          </w:tcPr>
+          <w:p>
+            <w:pPr>
+              <w:spacing w:after="0" w:line="375" w:lineRule="atLeast"/>
+              <w:rPr>
+                <w:rFonts w:ascii="Segoe UI" w:eastAsia="Times New Roman" w:hAnsi="Segoe UI" w:cs="Segoe UI"/>
+                <w:color w:val="0F1115"/>
+                <w:kern w:val="0"/>
+                <w:sz w:val="23"/>
+                <w:szCs w:val="23"/>
+                <w14:ligatures w14:val="none"/>
+              </w:rPr>
+            </w:pPr>
+            <w:r>
+              <w:rPr>
+                <w:rFonts w:ascii="Segoe UI" w:eastAsia="Times New Roman" w:hAnsi="Segoe UI" w:cs="Segoe UI"/>
+                <w:b/>
+                <w:bCs/>
+                <w:color w:val="0F1115"/>
+                <w:kern w:val="0"/>
+                <w:sz w:val="23"/>
+                <w:szCs w:val="23"/>
+                <w14:ligatures w14:val="none"/>
+              </w:rPr>
+              <w:t>Categories</w:t>
+            </w:r>
+          </w:p>
+        </w:tc>
+        <w:tc>
+          <w:tcPr>
+            <w:tcW w:w="2778" w:type="dxa"/>
+            <w:shd w:val="clear" w:color="auto" w:fill="FFFFFF"/>
+            <w:tcMar>
+              <w:top w:w="150" w:type="dxa"/>
+              <w:left w:w="240" w:type="dxa"/>
+              <w:bottom w:w="150" w:type="dxa"/>
+              <w:right w:w="240" w:type="dxa"/>
+            </w:tcMar>
+            <w:vAlign w:val="center"/>
+            <w:hideMark/>
+          </w:tcPr>
+          <w:p>
+            <w:pPr>
+              <w:spacing w:after="0" w:line="375" w:lineRule="atLeast"/>
+              <w:rPr>
+                <w:rFonts w:ascii="Segoe UI" w:eastAsia="Times New Roman" w:hAnsi="Segoe UI" w:cs="Segoe UI"/>
+                <w:color w:val="0F1115"/>
+                <w:kern w:val="0"/>
+                <w:sz w:val="23"/>
+                <w:szCs w:val="23"/>
+                <w14:ligatures w14:val="none"/>
+              </w:rPr>
+            </w:pPr>
+            <w:r>
+              <w:rPr>
+                <w:rFonts w:ascii="Segoe UI" w:eastAsia="Times New Roman" w:hAnsi="Segoe UI" w:cs="Segoe UI"/>
+                <w:b/>
+                <w:bCs/>
+                <w:color w:val="0F1115"/>
+                <w:kern w:val="0"/>
+                <w:sz w:val="23"/>
+                <w:szCs w:val="23"/>
+                <w14:ligatures w14:val="none"/>
+              </w:rPr>
+              <w:t>Monthly_Budgets</w:t>
+            </w:r>
+          </w:p>
+        </w:tc>
+        <w:tc>
+          <w:tcPr>
+            <w:tcW w:w="1980" w:type="dxa"/>
+            <w:shd w:val="clear" w:color="auto" w:fill="FFFFFF"/>
+            <w:tcMar>
+              <w:top w:w="150" w:type="dxa"/>
+              <w:left w:w="240" w:type="dxa"/>
+              <w:bottom w:w="150" w:type="dxa"/>
+              <w:right w:w="240" w:type="dxa"/>
+            </w:tcMar>
+            <w:vAlign w:val="center"/>
+            <w:hideMark/>
+          </w:tcPr>
+          <w:p>
+            <w:pPr>
+              <w:spacing w:after="0" w:line="375" w:lineRule="atLeast"/>
+              <w:rPr>
+                <w:rFonts w:ascii="Segoe UI" w:eastAsia="Times New Roman" w:hAnsi="Segoe UI" w:cs="Segoe UI"/>
+                <w:color w:val="0F1115"/>
+                <w:kern w:val="0"/>
+                <w:sz w:val="23"/>
+                <w:szCs w:val="23"/>
+                <w14:ligatures w14:val="none"/>
+              </w:rPr>
+            </w:pPr>
+            <w:r>
+              <w:rPr>
+                <w:rFonts w:ascii="Segoe UI" w:eastAsia="Times New Roman" w:hAnsi="Segoe UI" w:cs="Segoe UI"/>
+                <w:color w:val="0F1115"/>
+                <w:kern w:val="0"/>
+                <w:sz w:val="23"/>
+                <w:szCs w:val="23"/>
+                <w14:ligatures w14:val="none"/>
+              </w:rPr>
+              <w:t>One-to-Many</w:t>
+            </w:r>
+          </w:p>
+        </w:tc>
+        <w:tc>
+          <w:tcPr>
+            <w:tcW w:w="4860" w:type="dxa"/>
+            <w:shd w:val="clear" w:color="auto" w:fill="FFFFFF"/>
+            <w:tcMar>
+              <w:top w:w="150" w:type="dxa"/>
+              <w:left w:w="240" w:type="dxa"/>
+              <w:bottom w:w="150" w:type="dxa"/>
+              <w:right w:w="0" w:type="dxa"/>
+            </w:tcMar>
+            <w:vAlign w:val="center"/>
+            <w:hideMark/>
+          </w:tcPr>
+          <w:p>
+            <w:pPr>
+              <w:spacing w:after="0" w:line="375" w:lineRule="atLeast"/>
+              <w:rPr>
+                <w:rFonts w:ascii="Segoe UI" w:eastAsia="Times New Roman" w:hAnsi="Segoe UI" w:cs="Segoe UI"/>
+                <w:color w:val="0F1115"/>
+                <w:kern w:val="0"/>
+                <w:sz w:val="23"/>
+                <w:szCs w:val="23"/>
+                <w14:ligatures w14:val="none"/>
+              </w:rPr>
+            </w:pPr>
+            <w:r>
+              <w:rPr>
+                <w:rFonts w:ascii="Segoe UI" w:eastAsia="Times New Roman" w:hAnsi="Segoe UI" w:cs="Segoe UI"/>
+                <w:color w:val="0F1115"/>
+                <w:kern w:val="0"/>
+                <w:sz w:val="23"/>
+                <w:szCs w:val="23"/>
+                <w14:ligatures w14:val="none"/>
+              </w:rPr>
+              <w:t>One category can be used in many budget records</w:t>
+            </w:r>
+            <w:r>
+              <w:rPr>
+                <w:rFonts w:ascii="Segoe UI" w:eastAsia="Times New Roman" w:hAnsi="Segoe UI" w:cs="Segoe UI"/>
+                <w:color w:val="0F1115"/>
+                <w:kern w:val="0"/>
+                <w:sz w:val="23"/>
+                <w:szCs w:val="23"/>
+                <w14:ligatures w14:val="none"/>
+              </w:rPr>
+              <w:t>.</w:t>
+            </w:r>
+          </w:p>
+        </w:tc>
+      </w:tr>
+      <w:tr>
+        <w:tc>
+          <w:tcPr>
+            <w:tcW w:w="1627" w:type="dxa"/>
+            <w:shd w:val="clear" w:color="auto" w:fill="FFFFFF"/>
+            <w:tcMar>
+              <w:top w:w="150" w:type="dxa"/>
+              <w:left w:w="240" w:type="dxa"/>
+              <w:bottom w:w="150" w:type="dxa"/>
+              <w:right w:w="240" w:type="dxa"/>
+            </w:tcMar>
+            <w:vAlign w:val="center"/>
+            <w:hideMark/>
+          </w:tcPr>
+          <w:p>
+            <w:pPr>
+              <w:spacing w:after="0" w:line="375" w:lineRule="atLeast"/>
+              <w:rPr>
+                <w:rFonts w:ascii="Segoe UI" w:eastAsia="Times New Roman" w:hAnsi="Segoe UI" w:cs="Segoe UI"/>
+                <w:color w:val="0F1115"/>
+                <w:kern w:val="0"/>
+                <w:sz w:val="23"/>
+                <w:szCs w:val="23"/>
+                <w14:ligatures w14:val="none"/>
+              </w:rPr>
+            </w:pPr>
+            <w:r>
+              <w:rPr>
+                <w:rFonts w:ascii="Segoe UI" w:eastAsia="Times New Roman" w:hAnsi="Segoe UI" w:cs="Segoe UI"/>
+                <w:b/>
+                <w:bCs/>
+                <w:color w:val="0F1115"/>
+                <w:kern w:val="0"/>
+                <w:sz w:val="23"/>
+                <w:szCs w:val="23"/>
+                <w14:ligatures w14:val="none"/>
+              </w:rPr>
+              <w:t>Categories</w:t>
+            </w:r>
+          </w:p>
+        </w:tc>
+        <w:tc>
+          <w:tcPr>
+            <w:tcW w:w="2778" w:type="dxa"/>
+            <w:shd w:val="clear" w:color="auto" w:fill="FFFFFF"/>
+            <w:tcMar>
+              <w:top w:w="150" w:type="dxa"/>
+              <w:left w:w="240" w:type="dxa"/>
+              <w:bottom w:w="150" w:type="dxa"/>
+              <w:right w:w="240" w:type="dxa"/>
+            </w:tcMar>
+            <w:vAlign w:val="center"/>
+            <w:hideMark/>
+          </w:tcPr>
+          <w:p>
+            <w:pPr>
+              <w:spacing w:after="0" w:line="375" w:lineRule="atLeast"/>
+              <w:rPr>
+                <w:rFonts w:ascii="Segoe UI" w:eastAsia="Times New Roman" w:hAnsi="Segoe UI" w:cs="Segoe UI"/>
+                <w:color w:val="0F1115"/>
+                <w:kern w:val="0"/>
+                <w:sz w:val="23"/>
+                <w:szCs w:val="23"/>
+                <w14:ligatures w14:val="none"/>
+              </w:rPr>
+            </w:pPr>
+            <w:r>
+              <w:rPr>
+                <w:rFonts w:ascii="Segoe UI" w:eastAsia="Times New Roman" w:hAnsi="Segoe UI" w:cs="Segoe UI"/>
+                <w:b/>
+                <w:bCs/>
+                <w:color w:val="0F1115"/>
+                <w:kern w:val="0"/>
+                <w:sz w:val="23"/>
+                <w:szCs w:val="23"/>
+                <w14:ligatures w14:val="none"/>
+              </w:rPr>
+              <w:t>Budgets_Suggestions</w:t>
+            </w:r>
+          </w:p>
+        </w:tc>
+        <w:tc>
+          <w:tcPr>
+            <w:tcW w:w="1980" w:type="dxa"/>
+            <w:shd w:val="clear" w:color="auto" w:fill="FFFFFF"/>
+            <w:tcMar>
+              <w:top w:w="150" w:type="dxa"/>
+              <w:left w:w="240" w:type="dxa"/>
+              <w:bottom w:w="150" w:type="dxa"/>
+              <w:right w:w="240" w:type="dxa"/>
+            </w:tcMar>
+            <w:vAlign w:val="center"/>
+            <w:hideMark/>
+          </w:tcPr>
+          <w:p>
+            <w:pPr>
+              <w:spacing w:after="0" w:line="375" w:lineRule="atLeast"/>
+              <w:rPr>
+                <w:rFonts w:ascii="Segoe UI" w:eastAsia="Times New Roman" w:hAnsi="Segoe UI" w:cs="Segoe UI"/>
+                <w:color w:val="0F1115"/>
+                <w:kern w:val="0"/>
+                <w:sz w:val="23"/>
+                <w:szCs w:val="23"/>
+                <w14:ligatures w14:val="none"/>
+              </w:rPr>
+            </w:pPr>
+            <w:r>
+              <w:rPr>
+                <w:rFonts w:ascii="Segoe UI" w:eastAsia="Times New Roman" w:hAnsi="Segoe UI" w:cs="Segoe UI"/>
+                <w:color w:val="0F1115"/>
+                <w:kern w:val="0"/>
+                <w:sz w:val="23"/>
+                <w:szCs w:val="23"/>
+                <w14:ligatures w14:val="none"/>
+              </w:rPr>
+              <w:t>One-to-Many</w:t>
+            </w:r>
+          </w:p>
+        </w:tc>
+        <w:tc>
+          <w:tcPr>
+            <w:tcW w:w="4860" w:type="dxa"/>
+            <w:shd w:val="clear" w:color="auto" w:fill="FFFFFF"/>
+            <w:tcMar>
+              <w:top w:w="150" w:type="dxa"/>
+              <w:left w:w="240" w:type="dxa"/>
+              <w:bottom w:w="150" w:type="dxa"/>
+              <w:right w:w="0" w:type="dxa"/>
+            </w:tcMar>
+            <w:vAlign w:val="center"/>
+            <w:hideMark/>
+          </w:tcPr>
+          <w:p>
+            <w:pPr>
+              <w:spacing w:after="0" w:line="375" w:lineRule="atLeast"/>
+              <w:rPr>
+                <w:rFonts w:ascii="Segoe UI" w:eastAsia="Times New Roman" w:hAnsi="Segoe UI" w:cs="Segoe UI"/>
+                <w:color w:val="0F1115"/>
+                <w:kern w:val="0"/>
+                <w:sz w:val="23"/>
+                <w:szCs w:val="23"/>
+                <w14:ligatures w14:val="none"/>
+              </w:rPr>
+            </w:pPr>
+            <w:r>
+              <w:rPr>
+                <w:rFonts w:ascii="Segoe UI" w:eastAsia="Times New Roman" w:hAnsi="Segoe UI" w:cs="Segoe UI"/>
+                <w:color w:val="0F1115"/>
+                <w:kern w:val="0"/>
+                <w:sz w:val="23"/>
+                <w:szCs w:val="23"/>
+                <w14:ligatures w14:val="none"/>
+              </w:rPr>
+              <w:t>One category can have many suggestions</w:t>
+            </w:r>
+            <w:r>
+              <w:rPr>
+                <w:rFonts w:ascii="Segoe UI" w:eastAsia="Times New Roman" w:hAnsi="Segoe UI" w:cs="Segoe UI"/>
+                <w:color w:val="0F1115"/>
+                <w:kern w:val="0"/>
+                <w:sz w:val="23"/>
+                <w:szCs w:val="23"/>
+                <w14:ligatures w14:val="none"/>
+              </w:rPr>
+              <w:t>.</w:t>
+            </w:r>
+          </w:p>
+        </w:tc>
+      </w:tr>
+    </w:tbl>
+    <w:p>
+      <w:pPr>
+        <w:spacing w:line="360" w:lineRule="auto"/>
+        <w:rPr>
+          <w:rFonts w:ascii="Times New Roman" w:hAnsi="Times New Roman" w:cs="Times New Roman"/>
+          <w:b/>
+          <w:bCs/>
+          <w:u w:val="single"/>
         </w:rPr>
       </w:pPr>
     </w:p>
@@ -8557,7 +11013,7 @@
 <w:numbering xmlns:wpc="http://schemas.microsoft.com/office/word/2010/wordprocessingCanvas" xmlns:cx="http://schemas.microsoft.com/office/drawing/2014/chartex" xmlns:cx1="http://schemas.microsoft.com/office/drawing/2015/9/8/chartex" xmlns:cx2="http://schemas.microsoft.com/office/drawing/2015/10/21/chartex" xmlns:cx3="http://schemas.microsoft.com/office/drawing/2016/5/9/chartex" xmlns:cx4="http://schemas.microsoft.com/office/drawing/2016/5/10/chartex" xmlns:cx5="http://schemas.microsoft.com/office/drawing/2016/5/11/chartex" xmlns:cx6="http://schemas.microsoft.com/office/drawing/2016/5/12/chartex" xmlns:cx7="http://schemas.microsoft.com/office/drawing/2016/5/13/chartex" xmlns:cx8="http://schemas.microsoft.com/office/drawing/2016/5/14/chartex" xmlns:mc="http://schemas.openxmlformats.org/markup-compatibility/2006" xmlns:aink="http://schemas.microsoft.com/office/drawing/2016/ink" xmlns:am3d="http://schemas.microsoft.com/office/drawing/2017/model3d" xmlns:o="urn:schemas-microsoft-com:office:office" xmlns:oel="http://schemas.microsoft.com/office/2019/extlst" xmlns:r="http://schemas.openxmlformats.org/officeDocument/2006/relationships" xmlns:m="http://schemas.openxmlformats.org/officeDocument/2006/math" xmlns:v="urn:schemas-microsoft-com:vml" xmlns:wp14="http://schemas.microsoft.com/office/word/2010/wordprocessingDrawing" xmlns:wp="http://schemas.openxmlformats.org/drawingml/2006/wordprocessingDrawing" xmlns:w10="urn:schemas-microsoft-com:office:word" xmlns:w="http://schemas.openxmlformats.org/wordprocessingml/2006/main" xmlns:w14="http://schemas.microsoft.com/office/word/2010/wordml" xmlns:w15="http://schemas.microsoft.com/office/word/2012/wordml" xmlns:w16cex="http://schemas.microsoft.com/office/word/2018/wordml/cex" xmlns:w16cid="http://schemas.microsoft.com/office/word/2016/wordml/cid" xmlns:w16="http://schemas.microsoft.com/office/word/2018/wordml" xmlns:w16du="http://schemas.microsoft.com/office/word/2023/wordml/word16du" xmlns:w16sdtdh="http://schemas.microsoft.com/office/word/2020/wordml/sdtdatahash" xmlns:w16se="http://schemas.microsoft.com/office/word/2015/wordml/symex" xmlns:wpg="http://schemas.microsoft.com/office/word/2010/wordprocessingGroup" xmlns:wpi="http://schemas.microsoft.com/office/word/2010/wordprocessingInk" xmlns:wne="http://schemas.microsoft.com/office/word/2006/wordml" xmlns:wps="http://schemas.microsoft.com/office/word/2010/wordprocessingShape" mc:Ignorable="w14 w15 w16se w16cid w16 w16cex w16sdtdh w16du wp14">
   <w:numPicBullet w:numPicBulletId="0">
     <w:pict>
-      <v:rect id="_x0000_i1037" style="width:0;height:.75pt" o:hralign="center" o:bullet="t" o:hrstd="t" o:hr="t" fillcolor="#a0a0a0" stroked="f"/>
+      <v:rect id="_x0000_i1052" style="width:0;height:.75pt" o:hralign="center" o:bullet="t" o:hrstd="t" o:hr="t" fillcolor="#a0a0a0" stroked="f"/>
     </w:pict>
   </w:numPicBullet>
   <w:abstractNum w:abstractNumId="0" w15:restartNumberingAfterBreak="0">
@@ -9635,6 +12091,17 @@
       <w14:ligatures w14:val="none"/>
     </w:rPr>
   </w:style>
+  <w:style w:type="character" w:styleId="Strong">
+    <w:name w:val="Strong"/>
+    <w:basedOn w:val="DefaultParagraphFont"/>
+    <w:uiPriority w:val="22"/>
+    <w:qFormat/>
+    <w:rsid w:val="001105AE"/>
+    <w:rPr>
+      <w:b/>
+      <w:bCs/>
+    </w:rPr>
+  </w:style>
 </w:styles>
 </file>
 

</xml_diff>